<commit_message>
Java Control Flow Learning: Decision Making, Loops, Switch Statements, and Control Transfer  #31
</commit_message>
<xml_diff>
--- a/Chapter3/ControlFlow and opertions.docx
+++ b/Chapter3/ControlFlow and opertions.docx
@@ -702,16 +702,11 @@
       </w:pPr>
       <w:r>
         <w:lastRenderedPageBreak/>
-        <w:t xml:space="preserve">Relational </w:t>
-      </w:r>
-      <w:proofErr w:type="gramStart"/>
-      <w:r>
-        <w:t xml:space="preserve">Operators </w:t>
+        <w:t xml:space="preserve">Relational Operators </w:t>
       </w:r>
       <w:r>
         <w:t>:</w:t>
       </w:r>
-      <w:proofErr w:type="gramEnd"/>
       <w:r>
         <w:rPr>
           <w:rFonts w:asciiTheme="minorHAnsi" w:eastAsiaTheme="minorHAnsi" w:hAnsiTheme="minorHAnsi" w:cstheme="minorBidi"/>
@@ -724,13 +719,7 @@
         <w:t xml:space="preserve"> </w:t>
       </w:r>
       <w:r>
-        <w:t xml:space="preserve">are used to compare two values and return a </w:t>
-      </w:r>
-      <w:r>
-        <w:t>Boolean</w:t>
-      </w:r>
-      <w:r>
-        <w:t xml:space="preserve"> result (true or false).</w:t>
+        <w:t>are used to compare two values and return a Boolean result (true or false).</w:t>
       </w:r>
     </w:p>
     <w:tbl>
@@ -899,13 +888,8 @@
               <w:ind w:left="1287"/>
               <w:cnfStyle w:val="000000000000" w:firstRow="0" w:lastRow="0" w:firstColumn="0" w:lastColumn="0" w:oddVBand="0" w:evenVBand="0" w:oddHBand="0" w:evenHBand="0" w:firstRowFirstColumn="0" w:firstRowLastColumn="0" w:lastRowFirstColumn="0" w:lastRowLastColumn="0"/>
             </w:pPr>
-            <w:proofErr w:type="gramStart"/>
-            <w:r>
-              <w:t>5 !</w:t>
-            </w:r>
-            <w:proofErr w:type="gramEnd"/>
-            <w:r>
-              <w:t>= 3 → true</w:t>
+            <w:r>
+              <w:t>5 != 3 → true</w:t>
             </w:r>
           </w:p>
         </w:tc>
@@ -1134,15 +1118,7 @@
         </w:numPr>
       </w:pPr>
       <w:r>
-        <w:t xml:space="preserve">Relational operators always return </w:t>
-      </w:r>
-      <w:proofErr w:type="spellStart"/>
-      <w:r>
-        <w:t>boolean</w:t>
-      </w:r>
-      <w:proofErr w:type="spellEnd"/>
-      <w:r>
-        <w:t xml:space="preserve">. </w:t>
+        <w:t xml:space="preserve">Relational operators always return boolean. </w:t>
       </w:r>
     </w:p>
     <w:p>
@@ -1435,13 +1411,7 @@
         </w:numPr>
       </w:pPr>
       <w:r>
-        <w:t xml:space="preserve">Produces </w:t>
-      </w:r>
-      <w:r>
-        <w:t>Boolean</w:t>
-      </w:r>
-      <w:r>
-        <w:t xml:space="preserve"> results.</w:t>
+        <w:t>Produces Boolean results.</w:t>
       </w:r>
     </w:p>
     <w:p>
@@ -1458,18 +1428,10 @@
         </w:numPr>
       </w:pPr>
       <w:r>
-        <w:t xml:space="preserve">Assignment </w:t>
-      </w:r>
-      <w:proofErr w:type="gramStart"/>
-      <w:r>
-        <w:t xml:space="preserve">Operators </w:t>
-      </w:r>
-      <w:r>
-        <w:t>:</w:t>
-      </w:r>
-      <w:proofErr w:type="gramEnd"/>
-      <w:r>
-        <w:t xml:space="preserve"> </w:t>
+        <w:t xml:space="preserve">Assignment Operators </w:t>
+      </w:r>
+      <w:r>
+        <w:t xml:space="preserve">: </w:t>
       </w:r>
       <w:r>
         <w:t>are used to assign values to variables or update existing values.</w:t>
@@ -2128,15 +2090,7 @@
               <w:cnfStyle w:val="000000100000" w:firstRow="0" w:lastRow="0" w:firstColumn="0" w:lastColumn="0" w:oddVBand="0" w:evenVBand="0" w:oddHBand="1" w:evenHBand="0" w:firstRowFirstColumn="0" w:firstRowLastColumn="0" w:lastRowFirstColumn="0" w:lastRowLastColumn="0"/>
             </w:pPr>
             <w:r>
-              <w:t xml:space="preserve">Reverse </w:t>
-            </w:r>
-            <w:proofErr w:type="spellStart"/>
-            <w:r>
-              <w:t>boolean</w:t>
-            </w:r>
-            <w:proofErr w:type="spellEnd"/>
-            <w:r>
-              <w:t xml:space="preserve"> value</w:t>
+              <w:t>Reverse boolean value</w:t>
             </w:r>
           </w:p>
         </w:tc>
@@ -2689,30 +2643,7 @@
           <w:sz w:val="26"/>
           <w:szCs w:val="26"/>
         </w:rPr>
-        <w:t>:</w:t>
-      </w:r>
-      <w:r>
-        <w:rPr>
-          <w:sz w:val="26"/>
-          <w:szCs w:val="26"/>
-        </w:rPr>
-        <w:t xml:space="preserve"> is the region of a program where a variable is declared and can be accessed. In Java, a block (also called a compound statement) is a group of one or more statements enclosed within a pair of curly braces </w:t>
-      </w:r>
-      <w:proofErr w:type="gramStart"/>
-      <w:r>
-        <w:rPr>
-          <w:sz w:val="26"/>
-          <w:szCs w:val="26"/>
-        </w:rPr>
-        <w:t>{ }</w:t>
-      </w:r>
-      <w:proofErr w:type="gramEnd"/>
-      <w:r>
-        <w:rPr>
-          <w:sz w:val="26"/>
-          <w:szCs w:val="26"/>
-        </w:rPr>
-        <w:t>.</w:t>
+        <w:t>: is the region of a program where a variable is declared and can be accessed. In Java, a block (also called a compound statement) is a group of one or more statements enclosed within a pair of curly braces { }.</w:t>
       </w:r>
     </w:p>
     <w:p>
@@ -3097,9 +3028,2984 @@
     </w:p>
     <w:p>
       <w:pPr>
+        <w:pStyle w:val="ListParagraph"/>
+        <w:numPr>
+          <w:ilvl w:val="0"/>
+          <w:numId w:val="2"/>
+        </w:numPr>
+        <w:spacing w:line="480" w:lineRule="auto"/>
+        <w:ind w:left="426" w:hanging="284"/>
+        <w:rPr>
+          <w:b/>
+          <w:bCs/>
+          <w:sz w:val="26"/>
+          <w:szCs w:val="26"/>
+        </w:rPr>
+      </w:pPr>
+      <w:r>
+        <w:rPr>
+          <w:b/>
+          <w:bCs/>
+          <w:sz w:val="26"/>
+          <w:szCs w:val="26"/>
+        </w:rPr>
+        <w:t>Conditional Statements</w:t>
+      </w:r>
+    </w:p>
+    <w:p>
+      <w:pPr>
+        <w:pStyle w:val="ListParagraph"/>
         <w:spacing w:line="240" w:lineRule="auto"/>
-      </w:pPr>
-    </w:p>
+        <w:ind w:left="426"/>
+        <w:rPr>
+          <w:sz w:val="26"/>
+          <w:szCs w:val="26"/>
+        </w:rPr>
+      </w:pPr>
+      <w:r>
+        <w:rPr>
+          <w:sz w:val="26"/>
+          <w:szCs w:val="26"/>
+        </w:rPr>
+        <w:t>Just as people evaluate situations before taking action, a Java program uses conditional statements to determine what should happen based on specific conditions. Instead of executing every instruction, the program examines a condition and chooses the appropriate path. This ability to make decisions allows software to respond intelligently to different inputs and situations, making conditional statements one of the fundamental building blocks of programming.</w:t>
+      </w:r>
+    </w:p>
+    <w:p>
+      <w:pPr>
+        <w:pStyle w:val="ListParagraph"/>
+        <w:spacing w:line="240" w:lineRule="auto"/>
+        <w:ind w:left="426"/>
+        <w:rPr>
+          <w:sz w:val="26"/>
+          <w:szCs w:val="26"/>
+        </w:rPr>
+      </w:pPr>
+    </w:p>
+    <w:p>
+      <w:pPr>
+        <w:pStyle w:val="ListParagraph"/>
+        <w:spacing w:line="240" w:lineRule="auto"/>
+        <w:ind w:left="426"/>
+        <w:rPr>
+          <w:sz w:val="26"/>
+          <w:szCs w:val="26"/>
+        </w:rPr>
+      </w:pPr>
+      <w:r>
+        <w:rPr>
+          <w:b/>
+          <w:bCs/>
+          <w:sz w:val="26"/>
+          <w:szCs w:val="26"/>
+        </w:rPr>
+        <w:t>conditional statement</w:t>
+      </w:r>
+      <w:r>
+        <w:rPr>
+          <w:b/>
+          <w:bCs/>
+          <w:sz w:val="26"/>
+          <w:szCs w:val="26"/>
+        </w:rPr>
+        <w:t>:</w:t>
+      </w:r>
+      <w:r>
+        <w:rPr>
+          <w:sz w:val="26"/>
+          <w:szCs w:val="26"/>
+        </w:rPr>
+        <w:t xml:space="preserve"> is a control structure that allows a program to execute different blocks of code depending on whether a specified condition is </w:t>
+      </w:r>
+      <w:r>
+        <w:rPr>
+          <w:b/>
+          <w:bCs/>
+          <w:sz w:val="26"/>
+          <w:szCs w:val="26"/>
+        </w:rPr>
+        <w:t>true</w:t>
+      </w:r>
+      <w:r>
+        <w:rPr>
+          <w:sz w:val="26"/>
+          <w:szCs w:val="26"/>
+        </w:rPr>
+        <w:t xml:space="preserve"> or </w:t>
+      </w:r>
+      <w:r>
+        <w:rPr>
+          <w:b/>
+          <w:bCs/>
+          <w:sz w:val="26"/>
+          <w:szCs w:val="26"/>
+        </w:rPr>
+        <w:t>false</w:t>
+      </w:r>
+      <w:r>
+        <w:rPr>
+          <w:sz w:val="26"/>
+          <w:szCs w:val="26"/>
+        </w:rPr>
+        <w:t>.</w:t>
+      </w:r>
+    </w:p>
+    <w:p>
+      <w:pPr>
+        <w:pStyle w:val="ListParagraph"/>
+        <w:spacing w:line="240" w:lineRule="auto"/>
+        <w:ind w:left="426"/>
+        <w:rPr>
+          <w:sz w:val="26"/>
+          <w:szCs w:val="26"/>
+        </w:rPr>
+      </w:pPr>
+    </w:p>
+    <w:p>
+      <w:pPr>
+        <w:pStyle w:val="ListParagraph"/>
+        <w:spacing w:line="240" w:lineRule="auto"/>
+        <w:ind w:left="426"/>
+        <w:rPr>
+          <w:sz w:val="26"/>
+          <w:szCs w:val="26"/>
+        </w:rPr>
+      </w:pPr>
+    </w:p>
+    <w:p>
+      <w:pPr>
+        <w:pStyle w:val="ListParagraph"/>
+        <w:spacing w:line="240" w:lineRule="auto"/>
+        <w:ind w:left="426"/>
+        <w:rPr>
+          <w:sz w:val="26"/>
+          <w:szCs w:val="26"/>
+        </w:rPr>
+      </w:pPr>
+    </w:p>
+    <w:p>
+      <w:pPr>
+        <w:pStyle w:val="ListParagraph"/>
+        <w:spacing w:line="240" w:lineRule="auto"/>
+        <w:ind w:left="426"/>
+        <w:rPr>
+          <w:sz w:val="26"/>
+          <w:szCs w:val="26"/>
+        </w:rPr>
+      </w:pPr>
+    </w:p>
+    <w:p>
+      <w:pPr>
+        <w:pStyle w:val="ListParagraph"/>
+        <w:spacing w:line="240" w:lineRule="auto"/>
+        <w:ind w:left="426"/>
+        <w:rPr>
+          <w:sz w:val="26"/>
+          <w:szCs w:val="26"/>
+        </w:rPr>
+      </w:pPr>
+    </w:p>
+    <w:p>
+      <w:pPr>
+        <w:pStyle w:val="ListParagraph"/>
+        <w:spacing w:line="240" w:lineRule="auto"/>
+        <w:ind w:left="426"/>
+        <w:rPr>
+          <w:b/>
+          <w:bCs/>
+          <w:sz w:val="26"/>
+          <w:szCs w:val="26"/>
+        </w:rPr>
+      </w:pPr>
+      <w:r>
+        <w:rPr>
+          <w:b/>
+          <w:bCs/>
+          <w:sz w:val="26"/>
+          <w:szCs w:val="26"/>
+        </w:rPr>
+        <w:lastRenderedPageBreak/>
+        <w:t>The if Statement</w:t>
+      </w:r>
+    </w:p>
+    <w:p>
+      <w:pPr>
+        <w:spacing w:line="240" w:lineRule="auto"/>
+      </w:pPr>
+      <w:r>
+        <w:t xml:space="preserve">  </w:t>
+      </w:r>
+      <w:r>
+        <w:t xml:space="preserve">The </w:t>
+      </w:r>
+      <w:r>
+        <w:rPr>
+          <w:b/>
+          <w:bCs/>
+        </w:rPr>
+        <w:t>if statement</w:t>
+      </w:r>
+      <w:r>
+        <w:t xml:space="preserve"> is the simplest conditional statement. It executes a block of code </w:t>
+      </w:r>
+      <w:r>
+        <w:rPr>
+          <w:b/>
+          <w:bCs/>
+        </w:rPr>
+        <w:t>only when the specified condition evaluates to true</w:t>
+      </w:r>
+      <w:r>
+        <w:t>. If the condition is false, the program skips the block and continues with the next statement.</w:t>
+      </w:r>
+    </w:p>
+    <w:p>
+      <w:pPr>
+        <w:spacing w:line="240" w:lineRule="auto"/>
+      </w:pPr>
+    </w:p>
+    <w:p>
+      <w:pPr>
+        <w:spacing w:line="240" w:lineRule="auto"/>
+      </w:pPr>
+      <w:r>
+        <w:rPr>
+          <w:noProof/>
+        </w:rPr>
+        <w:drawing>
+          <wp:inline distT="0" distB="0" distL="0" distR="0" wp14:anchorId="4E9B62A9" wp14:editId="064F7946">
+            <wp:extent cx="6661150" cy="2079625"/>
+            <wp:effectExtent l="0" t="0" r="6350" b="0"/>
+            <wp:docPr id="1031384387" name="Picture 1"/>
+            <wp:cNvGraphicFramePr>
+              <a:graphicFrameLocks xmlns:a="http://schemas.openxmlformats.org/drawingml/2006/main" noChangeAspect="1"/>
+            </wp:cNvGraphicFramePr>
+            <a:graphic xmlns:a="http://schemas.openxmlformats.org/drawingml/2006/main">
+              <a:graphicData uri="http://schemas.openxmlformats.org/drawingml/2006/picture">
+                <pic:pic xmlns:pic="http://schemas.openxmlformats.org/drawingml/2006/picture">
+                  <pic:nvPicPr>
+                    <pic:cNvPr id="1031384387" name=""/>
+                    <pic:cNvPicPr/>
+                  </pic:nvPicPr>
+                  <pic:blipFill>
+                    <a:blip r:embed="rId9"/>
+                    <a:stretch>
+                      <a:fillRect/>
+                    </a:stretch>
+                  </pic:blipFill>
+                  <pic:spPr>
+                    <a:xfrm>
+                      <a:off x="0" y="0"/>
+                      <a:ext cx="6661150" cy="2079625"/>
+                    </a:xfrm>
+                    <a:prstGeom prst="rect">
+                      <a:avLst/>
+                    </a:prstGeom>
+                  </pic:spPr>
+                </pic:pic>
+              </a:graphicData>
+            </a:graphic>
+          </wp:inline>
+        </w:drawing>
+      </w:r>
+    </w:p>
+    <w:p>
+      <w:pPr>
+        <w:spacing w:line="240" w:lineRule="auto"/>
+      </w:pPr>
+    </w:p>
+    <w:p>
+      <w:pPr>
+        <w:pStyle w:val="ListParagraph"/>
+        <w:numPr>
+          <w:ilvl w:val="0"/>
+          <w:numId w:val="3"/>
+        </w:numPr>
+        <w:spacing w:line="240" w:lineRule="auto"/>
+      </w:pPr>
+      <w:r>
+        <w:t xml:space="preserve">The condition must return a </w:t>
+      </w:r>
+      <w:r>
+        <w:rPr>
+          <w:b/>
+          <w:bCs/>
+        </w:rPr>
+        <w:t>Boolean</w:t>
+      </w:r>
+      <w:r>
+        <w:rPr>
+          <w:b/>
+          <w:bCs/>
+        </w:rPr>
+        <w:t xml:space="preserve"> value</w:t>
+      </w:r>
+      <w:r>
+        <w:t xml:space="preserve"> (true or false). </w:t>
+      </w:r>
+    </w:p>
+    <w:p>
+      <w:pPr>
+        <w:pStyle w:val="ListParagraph"/>
+        <w:numPr>
+          <w:ilvl w:val="0"/>
+          <w:numId w:val="3"/>
+        </w:numPr>
+        <w:spacing w:line="240" w:lineRule="auto"/>
+      </w:pPr>
+      <w:r>
+        <w:t xml:space="preserve">Parentheses around the condition are mandatory. </w:t>
+      </w:r>
+    </w:p>
+    <w:p>
+      <w:pPr>
+        <w:pStyle w:val="ListParagraph"/>
+        <w:numPr>
+          <w:ilvl w:val="0"/>
+          <w:numId w:val="3"/>
+        </w:numPr>
+        <w:spacing w:line="240" w:lineRule="auto"/>
+      </w:pPr>
+      <w:r>
+        <w:t xml:space="preserve">Curly braces {} are recommended even when there is only one statement. </w:t>
+      </w:r>
+    </w:p>
+    <w:p>
+      <w:pPr>
+        <w:pStyle w:val="ListParagraph"/>
+        <w:numPr>
+          <w:ilvl w:val="0"/>
+          <w:numId w:val="3"/>
+        </w:numPr>
+        <w:spacing w:line="240" w:lineRule="auto"/>
+      </w:pPr>
+      <w:r>
+        <w:t>If the condition is false, the block is skipped.</w:t>
+      </w:r>
+    </w:p>
+    <w:p>
+      <w:pPr>
+        <w:rPr>
+          <w:b/>
+          <w:bCs/>
+        </w:rPr>
+      </w:pPr>
+      <w:r>
+        <w:rPr>
+          <w:b/>
+          <w:bCs/>
+        </w:rPr>
+        <w:t>The if...else Statement</w:t>
+      </w:r>
+    </w:p>
+    <w:p>
+      <w:r>
+        <w:t xml:space="preserve">The </w:t>
+      </w:r>
+      <w:r>
+        <w:rPr>
+          <w:b/>
+          <w:bCs/>
+        </w:rPr>
+        <w:t>if...else statement</w:t>
+      </w:r>
+      <w:r>
+        <w:t xml:space="preserve"> provides two possible execution paths. If the condition is true, the first block executes; otherwise, the else block executes.</w:t>
+      </w:r>
+    </w:p>
+    <w:p>
+      <w:pPr>
+        <w:rPr>
+          <w:noProof/>
+        </w:rPr>
+      </w:pPr>
+      <w:r>
+        <w:rPr>
+          <w:noProof/>
+        </w:rPr>
+        <w:drawing>
+          <wp:inline distT="0" distB="0" distL="0" distR="0" wp14:anchorId="57C97DF5" wp14:editId="32B00A2A">
+            <wp:extent cx="6661150" cy="2374900"/>
+            <wp:effectExtent l="0" t="0" r="6350" b="6350"/>
+            <wp:docPr id="1464087283" name="Picture 1"/>
+            <wp:cNvGraphicFramePr>
+              <a:graphicFrameLocks xmlns:a="http://schemas.openxmlformats.org/drawingml/2006/main" noChangeAspect="1"/>
+            </wp:cNvGraphicFramePr>
+            <a:graphic xmlns:a="http://schemas.openxmlformats.org/drawingml/2006/main">
+              <a:graphicData uri="http://schemas.openxmlformats.org/drawingml/2006/picture">
+                <pic:pic xmlns:pic="http://schemas.openxmlformats.org/drawingml/2006/picture">
+                  <pic:nvPicPr>
+                    <pic:cNvPr id="1464087283" name=""/>
+                    <pic:cNvPicPr/>
+                  </pic:nvPicPr>
+                  <pic:blipFill>
+                    <a:blip r:embed="rId10"/>
+                    <a:stretch>
+                      <a:fillRect/>
+                    </a:stretch>
+                  </pic:blipFill>
+                  <pic:spPr>
+                    <a:xfrm>
+                      <a:off x="0" y="0"/>
+                      <a:ext cx="6661150" cy="2374900"/>
+                    </a:xfrm>
+                    <a:prstGeom prst="rect">
+                      <a:avLst/>
+                    </a:prstGeom>
+                  </pic:spPr>
+                </pic:pic>
+              </a:graphicData>
+            </a:graphic>
+          </wp:inline>
+        </w:drawing>
+      </w:r>
+    </w:p>
+    <w:p>
+      <w:pPr>
+        <w:rPr>
+          <w:noProof/>
+        </w:rPr>
+      </w:pPr>
+    </w:p>
+    <w:p>
+      <w:pPr>
+        <w:pStyle w:val="ListParagraph"/>
+        <w:numPr>
+          <w:ilvl w:val="0"/>
+          <w:numId w:val="9"/>
+        </w:numPr>
+      </w:pPr>
+      <w:r>
+        <w:t xml:space="preserve">The else block is optional. </w:t>
+      </w:r>
+    </w:p>
+    <w:p>
+      <w:pPr>
+        <w:pStyle w:val="ListParagraph"/>
+        <w:numPr>
+          <w:ilvl w:val="0"/>
+          <w:numId w:val="9"/>
+        </w:numPr>
+      </w:pPr>
+      <w:r>
+        <w:t xml:space="preserve">Exactly one block executes. </w:t>
+      </w:r>
+    </w:p>
+    <w:p>
+      <w:pPr>
+        <w:pStyle w:val="ListParagraph"/>
+        <w:numPr>
+          <w:ilvl w:val="0"/>
+          <w:numId w:val="9"/>
+        </w:numPr>
+      </w:pPr>
+      <w:r>
+        <w:t>Improves program flexibility by handling both possible outcomes.</w:t>
+      </w:r>
+    </w:p>
+    <w:p>
+      <w:pPr>
+        <w:rPr>
+          <w:b/>
+          <w:bCs/>
+        </w:rPr>
+      </w:pPr>
+      <w:r>
+        <w:rPr>
+          <w:b/>
+          <w:bCs/>
+        </w:rPr>
+        <w:t>The if...else if...else Statement</w:t>
+      </w:r>
+    </w:p>
+    <w:p>
+      <w:r>
+        <w:t xml:space="preserve">When multiple conditions need to be evaluated, Java uses the </w:t>
+      </w:r>
+      <w:r>
+        <w:rPr>
+          <w:b/>
+          <w:bCs/>
+        </w:rPr>
+        <w:t>if...else if...else</w:t>
+      </w:r>
+      <w:r>
+        <w:t xml:space="preserve"> structure. Conditions are checked from top to bottom, and the </w:t>
+      </w:r>
+      <w:r>
+        <w:rPr>
+          <w:b/>
+          <w:bCs/>
+        </w:rPr>
+        <w:t>first condition that evaluates to true is executed</w:t>
+      </w:r>
+      <w:r>
+        <w:t>. Once a match is found, the remaining conditions are ignored.</w:t>
+      </w:r>
+    </w:p>
+    <w:p/>
+    <w:p>
+      <w:r>
+        <w:rPr>
+          <w:noProof/>
+        </w:rPr>
+        <w:lastRenderedPageBreak/>
+        <w:drawing>
+          <wp:inline distT="0" distB="0" distL="0" distR="0" wp14:anchorId="225D3443" wp14:editId="5114B2EA">
+            <wp:extent cx="6661150" cy="3013710"/>
+            <wp:effectExtent l="0" t="0" r="6350" b="0"/>
+            <wp:docPr id="1506466606" name="Picture 1"/>
+            <wp:cNvGraphicFramePr>
+              <a:graphicFrameLocks xmlns:a="http://schemas.openxmlformats.org/drawingml/2006/main" noChangeAspect="1"/>
+            </wp:cNvGraphicFramePr>
+            <a:graphic xmlns:a="http://schemas.openxmlformats.org/drawingml/2006/main">
+              <a:graphicData uri="http://schemas.openxmlformats.org/drawingml/2006/picture">
+                <pic:pic xmlns:pic="http://schemas.openxmlformats.org/drawingml/2006/picture">
+                  <pic:nvPicPr>
+                    <pic:cNvPr id="1506466606" name=""/>
+                    <pic:cNvPicPr/>
+                  </pic:nvPicPr>
+                  <pic:blipFill>
+                    <a:blip r:embed="rId11"/>
+                    <a:stretch>
+                      <a:fillRect/>
+                    </a:stretch>
+                  </pic:blipFill>
+                  <pic:spPr>
+                    <a:xfrm>
+                      <a:off x="0" y="0"/>
+                      <a:ext cx="6661150" cy="3013710"/>
+                    </a:xfrm>
+                    <a:prstGeom prst="rect">
+                      <a:avLst/>
+                    </a:prstGeom>
+                  </pic:spPr>
+                </pic:pic>
+              </a:graphicData>
+            </a:graphic>
+          </wp:inline>
+        </w:drawing>
+      </w:r>
+    </w:p>
+    <w:p>
+      <w:pPr>
+        <w:numPr>
+          <w:ilvl w:val="0"/>
+          <w:numId w:val="10"/>
+        </w:numPr>
+        <w:spacing w:line="240" w:lineRule="auto"/>
+      </w:pPr>
+      <w:r>
+        <w:t xml:space="preserve">Conditions are evaluated sequentially from top to bottom. </w:t>
+      </w:r>
+    </w:p>
+    <w:p>
+      <w:pPr>
+        <w:numPr>
+          <w:ilvl w:val="0"/>
+          <w:numId w:val="10"/>
+        </w:numPr>
+        <w:spacing w:line="240" w:lineRule="auto"/>
+      </w:pPr>
+      <w:r>
+        <w:t xml:space="preserve">Only the first matching condition executes. </w:t>
+      </w:r>
+    </w:p>
+    <w:p>
+      <w:pPr>
+        <w:numPr>
+          <w:ilvl w:val="0"/>
+          <w:numId w:val="10"/>
+        </w:numPr>
+        <w:spacing w:line="240" w:lineRule="auto"/>
+      </w:pPr>
+      <w:r>
+        <w:t xml:space="preserve">The else block serves as the default case when no conditions are true. </w:t>
+      </w:r>
+    </w:p>
+    <w:p>
+      <w:pPr>
+        <w:numPr>
+          <w:ilvl w:val="0"/>
+          <w:numId w:val="10"/>
+        </w:numPr>
+        <w:spacing w:line="240" w:lineRule="auto"/>
+      </w:pPr>
+      <w:r>
+        <w:t xml:space="preserve">Arrange conditions from the most specific to the most general. </w:t>
+      </w:r>
+    </w:p>
+    <w:p>
+      <w:pPr>
+        <w:rPr>
+          <w:b/>
+          <w:bCs/>
+        </w:rPr>
+      </w:pPr>
+      <w:r>
+        <w:rPr>
+          <w:b/>
+          <w:bCs/>
+        </w:rPr>
+        <w:t>Nested if Statements</w:t>
+      </w:r>
+    </w:p>
+    <w:p>
+      <w:r>
+        <w:t xml:space="preserve">An </w:t>
+      </w:r>
+      <w:r>
+        <w:rPr>
+          <w:b/>
+          <w:bCs/>
+        </w:rPr>
+        <w:t>if statement</w:t>
+      </w:r>
+      <w:r>
+        <w:t xml:space="preserve"> can be placed inside another if statement. This is called a </w:t>
+      </w:r>
+      <w:r>
+        <w:rPr>
+          <w:b/>
+          <w:bCs/>
+        </w:rPr>
+        <w:t>nested if</w:t>
+      </w:r>
+      <w:r>
+        <w:t>, allowing more detailed decision-making.</w:t>
+      </w:r>
+    </w:p>
+    <w:p>
+      <w:r>
+        <w:rPr>
+          <w:noProof/>
+        </w:rPr>
+        <w:drawing>
+          <wp:inline distT="0" distB="0" distL="0" distR="0" wp14:anchorId="023A245A" wp14:editId="7FDF5025">
+            <wp:extent cx="6661150" cy="2609215"/>
+            <wp:effectExtent l="0" t="0" r="6350" b="635"/>
+            <wp:docPr id="1269881907" name="Picture 1"/>
+            <wp:cNvGraphicFramePr>
+              <a:graphicFrameLocks xmlns:a="http://schemas.openxmlformats.org/drawingml/2006/main" noChangeAspect="1"/>
+            </wp:cNvGraphicFramePr>
+            <a:graphic xmlns:a="http://schemas.openxmlformats.org/drawingml/2006/main">
+              <a:graphicData uri="http://schemas.openxmlformats.org/drawingml/2006/picture">
+                <pic:pic xmlns:pic="http://schemas.openxmlformats.org/drawingml/2006/picture">
+                  <pic:nvPicPr>
+                    <pic:cNvPr id="1269881907" name=""/>
+                    <pic:cNvPicPr/>
+                  </pic:nvPicPr>
+                  <pic:blipFill>
+                    <a:blip r:embed="rId12"/>
+                    <a:stretch>
+                      <a:fillRect/>
+                    </a:stretch>
+                  </pic:blipFill>
+                  <pic:spPr>
+                    <a:xfrm>
+                      <a:off x="0" y="0"/>
+                      <a:ext cx="6661150" cy="2609215"/>
+                    </a:xfrm>
+                    <a:prstGeom prst="rect">
+                      <a:avLst/>
+                    </a:prstGeom>
+                  </pic:spPr>
+                </pic:pic>
+              </a:graphicData>
+            </a:graphic>
+          </wp:inline>
+        </w:drawing>
+      </w:r>
+    </w:p>
+    <w:p>
+      <w:pPr>
+        <w:rPr>
+          <w:b/>
+          <w:bCs/>
+        </w:rPr>
+      </w:pPr>
+      <w:r>
+        <w:t xml:space="preserve">When an else appears without braces, Java automatically associates it with the </w:t>
+      </w:r>
+      <w:r>
+        <w:rPr>
+          <w:b/>
+          <w:bCs/>
+        </w:rPr>
+        <w:t>nearest unmatched if</w:t>
+      </w:r>
+    </w:p>
+    <w:p>
+      <w:pPr>
+        <w:rPr>
+          <w:b/>
+          <w:bCs/>
+        </w:rPr>
+      </w:pPr>
+    </w:p>
+    <w:p>
+      <w:pPr>
+        <w:pStyle w:val="ListParagraph"/>
+        <w:numPr>
+          <w:ilvl w:val="0"/>
+          <w:numId w:val="2"/>
+        </w:numPr>
+        <w:spacing w:line="480" w:lineRule="auto"/>
+        <w:ind w:left="426" w:hanging="284"/>
+        <w:rPr>
+          <w:b/>
+          <w:bCs/>
+          <w:sz w:val="26"/>
+          <w:szCs w:val="26"/>
+        </w:rPr>
+      </w:pPr>
+      <w:r>
+        <w:rPr>
+          <w:b/>
+          <w:bCs/>
+          <w:sz w:val="26"/>
+          <w:szCs w:val="26"/>
+        </w:rPr>
+        <w:t>Loops</w:t>
+      </w:r>
+    </w:p>
+    <w:p>
+      <w:pPr>
+        <w:spacing w:line="240" w:lineRule="auto"/>
+        <w:ind w:left="720"/>
+        <w:rPr>
+          <w:sz w:val="26"/>
+          <w:szCs w:val="26"/>
+        </w:rPr>
+      </w:pPr>
+      <w:r>
+        <w:rPr>
+          <w:sz w:val="26"/>
+          <w:szCs w:val="26"/>
+        </w:rPr>
+        <w:t>A loop is a control structure that repeatedly executes a block of code as long as a specified condition remains true.</w:t>
+      </w:r>
+    </w:p>
+    <w:p>
+      <w:pPr>
+        <w:spacing w:line="240" w:lineRule="auto"/>
+        <w:ind w:left="720"/>
+        <w:rPr>
+          <w:sz w:val="26"/>
+          <w:szCs w:val="26"/>
+        </w:rPr>
+      </w:pPr>
+      <w:r>
+        <w:rPr>
+          <w:sz w:val="26"/>
+          <w:szCs w:val="26"/>
+        </w:rPr>
+        <w:t>Loops help programmers automate repetitive operations without duplicating code.</w:t>
+      </w:r>
+    </w:p>
+    <w:p>
+      <w:pPr>
+        <w:spacing w:line="240" w:lineRule="auto"/>
+        <w:ind w:left="720"/>
+        <w:rPr>
+          <w:sz w:val="26"/>
+          <w:szCs w:val="26"/>
+        </w:rPr>
+      </w:pPr>
+      <w:r>
+        <w:rPr>
+          <w:sz w:val="26"/>
+          <w:szCs w:val="26"/>
+        </w:rPr>
+        <w:t>Java provides several looping structures, including:</w:t>
+      </w:r>
+    </w:p>
+    <w:p>
+      <w:pPr>
+        <w:numPr>
+          <w:ilvl w:val="0"/>
+          <w:numId w:val="11"/>
+        </w:numPr>
+        <w:spacing w:line="240" w:lineRule="auto"/>
+        <w:rPr>
+          <w:sz w:val="26"/>
+          <w:szCs w:val="26"/>
+        </w:rPr>
+      </w:pPr>
+      <w:r>
+        <w:rPr>
+          <w:sz w:val="26"/>
+          <w:szCs w:val="26"/>
+        </w:rPr>
+        <w:lastRenderedPageBreak/>
+        <w:t xml:space="preserve">while loop </w:t>
+      </w:r>
+    </w:p>
+    <w:p>
+      <w:pPr>
+        <w:numPr>
+          <w:ilvl w:val="0"/>
+          <w:numId w:val="11"/>
+        </w:numPr>
+        <w:spacing w:line="240" w:lineRule="auto"/>
+        <w:rPr>
+          <w:sz w:val="26"/>
+          <w:szCs w:val="26"/>
+        </w:rPr>
+      </w:pPr>
+      <w:r>
+        <w:rPr>
+          <w:sz w:val="26"/>
+          <w:szCs w:val="26"/>
+        </w:rPr>
+        <w:t xml:space="preserve">do...while loop </w:t>
+      </w:r>
+    </w:p>
+    <w:p>
+      <w:pPr>
+        <w:numPr>
+          <w:ilvl w:val="0"/>
+          <w:numId w:val="11"/>
+        </w:numPr>
+        <w:spacing w:line="240" w:lineRule="auto"/>
+        <w:rPr>
+          <w:sz w:val="26"/>
+          <w:szCs w:val="26"/>
+        </w:rPr>
+      </w:pPr>
+      <w:r>
+        <w:rPr>
+          <w:sz w:val="26"/>
+          <w:szCs w:val="26"/>
+        </w:rPr>
+        <w:t>for loop</w:t>
+      </w:r>
+    </w:p>
+    <w:p>
+      <w:pPr>
+        <w:spacing w:line="480" w:lineRule="auto"/>
+        <w:ind w:left="720"/>
+        <w:rPr>
+          <w:b/>
+          <w:bCs/>
+          <w:sz w:val="26"/>
+          <w:szCs w:val="26"/>
+        </w:rPr>
+      </w:pPr>
+      <w:r>
+        <w:rPr>
+          <w:b/>
+          <w:bCs/>
+          <w:sz w:val="26"/>
+          <w:szCs w:val="26"/>
+        </w:rPr>
+        <w:t>The while Loop</w:t>
+      </w:r>
+    </w:p>
+    <w:p>
+      <w:pPr>
+        <w:spacing w:line="240" w:lineRule="auto"/>
+        <w:ind w:left="720"/>
+        <w:rPr>
+          <w:sz w:val="26"/>
+          <w:szCs w:val="26"/>
+        </w:rPr>
+      </w:pPr>
+      <w:r>
+        <w:rPr>
+          <w:sz w:val="26"/>
+          <w:szCs w:val="26"/>
+        </w:rPr>
+        <w:t xml:space="preserve">The </w:t>
+      </w:r>
+      <w:r>
+        <w:rPr>
+          <w:b/>
+          <w:bCs/>
+          <w:sz w:val="26"/>
+          <w:szCs w:val="26"/>
+        </w:rPr>
+        <w:t>while loop</w:t>
+      </w:r>
+      <w:r>
+        <w:rPr>
+          <w:sz w:val="26"/>
+          <w:szCs w:val="26"/>
+        </w:rPr>
+        <w:t xml:space="preserve"> repeatedly executes a statement or block of statements </w:t>
+      </w:r>
+      <w:r>
+        <w:rPr>
+          <w:b/>
+          <w:bCs/>
+          <w:sz w:val="26"/>
+          <w:szCs w:val="26"/>
+        </w:rPr>
+        <w:t>as long as the specified condition evaluates to true</w:t>
+      </w:r>
+      <w:r>
+        <w:rPr>
+          <w:sz w:val="26"/>
+          <w:szCs w:val="26"/>
+        </w:rPr>
+        <w:t>.</w:t>
+      </w:r>
+    </w:p>
+    <w:p>
+      <w:pPr>
+        <w:spacing w:line="240" w:lineRule="auto"/>
+        <w:ind w:left="720"/>
+        <w:rPr>
+          <w:sz w:val="26"/>
+          <w:szCs w:val="26"/>
+        </w:rPr>
+      </w:pPr>
+      <w:r>
+        <w:rPr>
+          <w:sz w:val="26"/>
+          <w:szCs w:val="26"/>
+        </w:rPr>
+        <w:t xml:space="preserve">The condition is evaluated </w:t>
+      </w:r>
+      <w:r>
+        <w:rPr>
+          <w:b/>
+          <w:bCs/>
+          <w:sz w:val="26"/>
+          <w:szCs w:val="26"/>
+        </w:rPr>
+        <w:t>before</w:t>
+      </w:r>
+      <w:r>
+        <w:rPr>
+          <w:sz w:val="26"/>
+          <w:szCs w:val="26"/>
+        </w:rPr>
+        <w:t xml:space="preserve"> each iteration. Therefore, if the condition is initially false, the loop body is never executed.</w:t>
+      </w:r>
+    </w:p>
+    <w:p>
+      <w:pPr>
+        <w:pStyle w:val="ListParagraph"/>
+        <w:numPr>
+          <w:ilvl w:val="0"/>
+          <w:numId w:val="12"/>
+        </w:numPr>
+        <w:spacing w:line="240" w:lineRule="auto"/>
+        <w:rPr>
+          <w:sz w:val="26"/>
+          <w:szCs w:val="26"/>
+        </w:rPr>
+      </w:pPr>
+      <w:r>
+        <w:rPr>
+          <w:sz w:val="26"/>
+          <w:szCs w:val="26"/>
+        </w:rPr>
+        <w:t xml:space="preserve">Evaluate the condition. </w:t>
+      </w:r>
+    </w:p>
+    <w:p>
+      <w:pPr>
+        <w:pStyle w:val="ListParagraph"/>
+        <w:numPr>
+          <w:ilvl w:val="0"/>
+          <w:numId w:val="12"/>
+        </w:numPr>
+        <w:spacing w:line="240" w:lineRule="auto"/>
+        <w:rPr>
+          <w:sz w:val="26"/>
+          <w:szCs w:val="26"/>
+        </w:rPr>
+      </w:pPr>
+      <w:r>
+        <w:rPr>
+          <w:sz w:val="26"/>
+          <w:szCs w:val="26"/>
+        </w:rPr>
+        <w:t xml:space="preserve">If the condition is true, execute the loop body. </w:t>
+      </w:r>
+    </w:p>
+    <w:p>
+      <w:pPr>
+        <w:pStyle w:val="ListParagraph"/>
+        <w:numPr>
+          <w:ilvl w:val="0"/>
+          <w:numId w:val="12"/>
+        </w:numPr>
+        <w:spacing w:line="240" w:lineRule="auto"/>
+        <w:rPr>
+          <w:sz w:val="26"/>
+          <w:szCs w:val="26"/>
+        </w:rPr>
+      </w:pPr>
+      <w:r>
+        <w:rPr>
+          <w:sz w:val="26"/>
+          <w:szCs w:val="26"/>
+        </w:rPr>
+        <w:t xml:space="preserve">Return to the condition. </w:t>
+      </w:r>
+    </w:p>
+    <w:p>
+      <w:pPr>
+        <w:pStyle w:val="ListParagraph"/>
+        <w:numPr>
+          <w:ilvl w:val="0"/>
+          <w:numId w:val="12"/>
+        </w:numPr>
+        <w:spacing w:line="240" w:lineRule="auto"/>
+        <w:rPr>
+          <w:sz w:val="26"/>
+          <w:szCs w:val="26"/>
+        </w:rPr>
+      </w:pPr>
+      <w:r>
+        <w:rPr>
+          <w:sz w:val="26"/>
+          <w:szCs w:val="26"/>
+        </w:rPr>
+        <w:t xml:space="preserve">Repeat until the condition becomes false. </w:t>
+      </w:r>
+    </w:p>
+    <w:p>
+      <w:pPr>
+        <w:pStyle w:val="ListParagraph"/>
+        <w:numPr>
+          <w:ilvl w:val="0"/>
+          <w:numId w:val="12"/>
+        </w:numPr>
+        <w:spacing w:line="240" w:lineRule="auto"/>
+        <w:rPr>
+          <w:sz w:val="26"/>
+          <w:szCs w:val="26"/>
+        </w:rPr>
+      </w:pPr>
+      <w:r>
+        <w:rPr>
+          <w:sz w:val="26"/>
+          <w:szCs w:val="26"/>
+        </w:rPr>
+        <w:t>Continue executing the remaining program.</w:t>
+      </w:r>
+    </w:p>
+    <w:p>
+      <w:pPr>
+        <w:spacing w:line="240" w:lineRule="auto"/>
+        <w:rPr>
+          <w:b/>
+          <w:bCs/>
+          <w:sz w:val="26"/>
+          <w:szCs w:val="26"/>
+        </w:rPr>
+      </w:pPr>
+      <w:r>
+        <w:rPr>
+          <w:noProof/>
+        </w:rPr>
+        <w:drawing>
+          <wp:inline distT="0" distB="0" distL="0" distR="0" wp14:anchorId="115C2A25" wp14:editId="31628340">
+            <wp:extent cx="6661150" cy="2015490"/>
+            <wp:effectExtent l="0" t="0" r="6350" b="3810"/>
+            <wp:docPr id="1511476114" name="Picture 1"/>
+            <wp:cNvGraphicFramePr>
+              <a:graphicFrameLocks xmlns:a="http://schemas.openxmlformats.org/drawingml/2006/main" noChangeAspect="1"/>
+            </wp:cNvGraphicFramePr>
+            <a:graphic xmlns:a="http://schemas.openxmlformats.org/drawingml/2006/main">
+              <a:graphicData uri="http://schemas.openxmlformats.org/drawingml/2006/picture">
+                <pic:pic xmlns:pic="http://schemas.openxmlformats.org/drawingml/2006/picture">
+                  <pic:nvPicPr>
+                    <pic:cNvPr id="1511476114" name=""/>
+                    <pic:cNvPicPr/>
+                  </pic:nvPicPr>
+                  <pic:blipFill>
+                    <a:blip r:embed="rId13"/>
+                    <a:stretch>
+                      <a:fillRect/>
+                    </a:stretch>
+                  </pic:blipFill>
+                  <pic:spPr>
+                    <a:xfrm>
+                      <a:off x="0" y="0"/>
+                      <a:ext cx="6661150" cy="2015490"/>
+                    </a:xfrm>
+                    <a:prstGeom prst="rect">
+                      <a:avLst/>
+                    </a:prstGeom>
+                  </pic:spPr>
+                </pic:pic>
+              </a:graphicData>
+            </a:graphic>
+          </wp:inline>
+        </w:drawing>
+      </w:r>
+    </w:p>
+    <w:p>
+      <w:pPr>
+        <w:spacing w:line="240" w:lineRule="auto"/>
+        <w:rPr>
+          <w:b/>
+          <w:bCs/>
+          <w:sz w:val="26"/>
+          <w:szCs w:val="26"/>
+        </w:rPr>
+      </w:pPr>
+      <w:r>
+        <w:rPr>
+          <w:b/>
+          <w:bCs/>
+          <w:sz w:val="26"/>
+          <w:szCs w:val="26"/>
+        </w:rPr>
+        <w:t>The do...while Loop</w:t>
+      </w:r>
+    </w:p>
+    <w:p>
+      <w:pPr>
+        <w:spacing w:line="240" w:lineRule="auto"/>
+        <w:rPr>
+          <w:sz w:val="26"/>
+          <w:szCs w:val="26"/>
+        </w:rPr>
+      </w:pPr>
+      <w:r>
+        <w:rPr>
+          <w:sz w:val="26"/>
+          <w:szCs w:val="26"/>
+        </w:rPr>
+        <w:t xml:space="preserve">The </w:t>
+      </w:r>
+      <w:r>
+        <w:rPr>
+          <w:b/>
+          <w:bCs/>
+          <w:sz w:val="26"/>
+          <w:szCs w:val="26"/>
+        </w:rPr>
+        <w:t>do...while loop</w:t>
+      </w:r>
+      <w:r>
+        <w:rPr>
+          <w:sz w:val="26"/>
+          <w:szCs w:val="26"/>
+        </w:rPr>
+        <w:t xml:space="preserve"> executes the loop body </w:t>
+      </w:r>
+      <w:r>
+        <w:rPr>
+          <w:b/>
+          <w:bCs/>
+          <w:sz w:val="26"/>
+          <w:szCs w:val="26"/>
+        </w:rPr>
+        <w:t>first</w:t>
+      </w:r>
+      <w:r>
+        <w:rPr>
+          <w:sz w:val="26"/>
+          <w:szCs w:val="26"/>
+        </w:rPr>
+        <w:t xml:space="preserve"> and checks the condition </w:t>
+      </w:r>
+      <w:r>
+        <w:rPr>
+          <w:b/>
+          <w:bCs/>
+          <w:sz w:val="26"/>
+          <w:szCs w:val="26"/>
+        </w:rPr>
+        <w:t>after</w:t>
+      </w:r>
+      <w:r>
+        <w:rPr>
+          <w:sz w:val="26"/>
+          <w:szCs w:val="26"/>
+        </w:rPr>
+        <w:t xml:space="preserve"> execution.</w:t>
+      </w:r>
+    </w:p>
+    <w:p>
+      <w:pPr>
+        <w:spacing w:line="240" w:lineRule="auto"/>
+        <w:rPr>
+          <w:sz w:val="26"/>
+          <w:szCs w:val="26"/>
+        </w:rPr>
+      </w:pPr>
+      <w:r>
+        <w:rPr>
+          <w:sz w:val="26"/>
+          <w:szCs w:val="26"/>
+        </w:rPr>
+        <w:t xml:space="preserve">Because the condition is evaluated at the end, the loop body always executes </w:t>
+      </w:r>
+      <w:r>
+        <w:rPr>
+          <w:b/>
+          <w:bCs/>
+          <w:sz w:val="26"/>
+          <w:szCs w:val="26"/>
+        </w:rPr>
+        <w:t>at least once</w:t>
+      </w:r>
+      <w:r>
+        <w:rPr>
+          <w:sz w:val="26"/>
+          <w:szCs w:val="26"/>
+        </w:rPr>
+        <w:t>, regardless of the condition.</w:t>
+      </w:r>
+    </w:p>
+    <w:p>
+      <w:pPr>
+        <w:spacing w:line="240" w:lineRule="auto"/>
+        <w:rPr>
+          <w:b/>
+          <w:bCs/>
+          <w:sz w:val="26"/>
+          <w:szCs w:val="26"/>
+        </w:rPr>
+      </w:pPr>
+      <w:r>
+        <w:rPr>
+          <w:b/>
+          <w:bCs/>
+          <w:sz w:val="26"/>
+          <w:szCs w:val="26"/>
+        </w:rPr>
+        <w:t>How the do...while Loop Works</w:t>
+      </w:r>
+    </w:p>
+    <w:p>
+      <w:pPr>
+        <w:numPr>
+          <w:ilvl w:val="0"/>
+          <w:numId w:val="13"/>
+        </w:numPr>
+        <w:spacing w:line="240" w:lineRule="auto"/>
+        <w:rPr>
+          <w:sz w:val="26"/>
+          <w:szCs w:val="26"/>
+        </w:rPr>
+      </w:pPr>
+      <w:r>
+        <w:rPr>
+          <w:sz w:val="26"/>
+          <w:szCs w:val="26"/>
+        </w:rPr>
+        <w:t xml:space="preserve">Execute the loop body. </w:t>
+      </w:r>
+    </w:p>
+    <w:p>
+      <w:pPr>
+        <w:numPr>
+          <w:ilvl w:val="0"/>
+          <w:numId w:val="13"/>
+        </w:numPr>
+        <w:spacing w:line="240" w:lineRule="auto"/>
+        <w:rPr>
+          <w:sz w:val="26"/>
+          <w:szCs w:val="26"/>
+        </w:rPr>
+      </w:pPr>
+      <w:r>
+        <w:rPr>
+          <w:sz w:val="26"/>
+          <w:szCs w:val="26"/>
+        </w:rPr>
+        <w:t xml:space="preserve">Evaluate the condition. </w:t>
+      </w:r>
+    </w:p>
+    <w:p>
+      <w:pPr>
+        <w:numPr>
+          <w:ilvl w:val="0"/>
+          <w:numId w:val="13"/>
+        </w:numPr>
+        <w:spacing w:line="240" w:lineRule="auto"/>
+        <w:rPr>
+          <w:sz w:val="26"/>
+          <w:szCs w:val="26"/>
+        </w:rPr>
+      </w:pPr>
+      <w:r>
+        <w:rPr>
+          <w:sz w:val="26"/>
+          <w:szCs w:val="26"/>
+        </w:rPr>
+        <w:t xml:space="preserve">If the condition is </w:t>
+      </w:r>
+      <w:r>
+        <w:rPr>
+          <w:b/>
+          <w:bCs/>
+          <w:sz w:val="26"/>
+          <w:szCs w:val="26"/>
+        </w:rPr>
+        <w:t>true</w:t>
+      </w:r>
+      <w:r>
+        <w:rPr>
+          <w:sz w:val="26"/>
+          <w:szCs w:val="26"/>
+        </w:rPr>
+        <w:t xml:space="preserve">, repeat the loop. </w:t>
+      </w:r>
+    </w:p>
+    <w:p>
+      <w:pPr>
+        <w:numPr>
+          <w:ilvl w:val="0"/>
+          <w:numId w:val="13"/>
+        </w:numPr>
+        <w:spacing w:line="240" w:lineRule="auto"/>
+        <w:rPr>
+          <w:sz w:val="26"/>
+          <w:szCs w:val="26"/>
+        </w:rPr>
+      </w:pPr>
+      <w:r>
+        <w:rPr>
+          <w:sz w:val="26"/>
+          <w:szCs w:val="26"/>
+        </w:rPr>
+        <w:t xml:space="preserve">If the condition is </w:t>
+      </w:r>
+      <w:r>
+        <w:rPr>
+          <w:b/>
+          <w:bCs/>
+          <w:sz w:val="26"/>
+          <w:szCs w:val="26"/>
+        </w:rPr>
+        <w:t>false</w:t>
+      </w:r>
+      <w:r>
+        <w:rPr>
+          <w:sz w:val="26"/>
+          <w:szCs w:val="26"/>
+        </w:rPr>
+        <w:t>, exit the loop.</w:t>
+      </w:r>
+    </w:p>
+    <w:p>
+      <w:pPr>
+        <w:spacing w:line="240" w:lineRule="auto"/>
+        <w:rPr>
+          <w:sz w:val="26"/>
+          <w:szCs w:val="26"/>
+        </w:rPr>
+      </w:pPr>
+    </w:p>
+    <w:p>
+      <w:pPr>
+        <w:spacing w:line="240" w:lineRule="auto"/>
+        <w:rPr>
+          <w:sz w:val="26"/>
+          <w:szCs w:val="26"/>
+        </w:rPr>
+      </w:pPr>
+    </w:p>
+    <w:p>
+      <w:pPr>
+        <w:spacing w:line="240" w:lineRule="auto"/>
+        <w:rPr>
+          <w:sz w:val="26"/>
+          <w:szCs w:val="26"/>
+        </w:rPr>
+      </w:pPr>
+    </w:p>
+    <w:p>
+      <w:pPr>
+        <w:spacing w:line="240" w:lineRule="auto"/>
+        <w:rPr>
+          <w:sz w:val="26"/>
+          <w:szCs w:val="26"/>
+        </w:rPr>
+      </w:pPr>
+      <w:r>
+        <w:rPr>
+          <w:noProof/>
+        </w:rPr>
+        <w:lastRenderedPageBreak/>
+        <w:drawing>
+          <wp:inline distT="0" distB="0" distL="0" distR="0" wp14:anchorId="04F1F6A0" wp14:editId="3DEE6A6F">
+            <wp:extent cx="6661150" cy="4411345"/>
+            <wp:effectExtent l="0" t="0" r="6350" b="8255"/>
+            <wp:docPr id="632665109" name="Picture 1"/>
+            <wp:cNvGraphicFramePr>
+              <a:graphicFrameLocks xmlns:a="http://schemas.openxmlformats.org/drawingml/2006/main" noChangeAspect="1"/>
+            </wp:cNvGraphicFramePr>
+            <a:graphic xmlns:a="http://schemas.openxmlformats.org/drawingml/2006/main">
+              <a:graphicData uri="http://schemas.openxmlformats.org/drawingml/2006/picture">
+                <pic:pic xmlns:pic="http://schemas.openxmlformats.org/drawingml/2006/picture">
+                  <pic:nvPicPr>
+                    <pic:cNvPr id="632665109" name=""/>
+                    <pic:cNvPicPr/>
+                  </pic:nvPicPr>
+                  <pic:blipFill>
+                    <a:blip r:embed="rId14"/>
+                    <a:stretch>
+                      <a:fillRect/>
+                    </a:stretch>
+                  </pic:blipFill>
+                  <pic:spPr>
+                    <a:xfrm>
+                      <a:off x="0" y="0"/>
+                      <a:ext cx="6661150" cy="4411345"/>
+                    </a:xfrm>
+                    <a:prstGeom prst="rect">
+                      <a:avLst/>
+                    </a:prstGeom>
+                  </pic:spPr>
+                </pic:pic>
+              </a:graphicData>
+            </a:graphic>
+          </wp:inline>
+        </w:drawing>
+      </w:r>
+    </w:p>
+    <w:p>
+      <w:pPr>
+        <w:pStyle w:val="ListParagraph"/>
+        <w:numPr>
+          <w:ilvl w:val="0"/>
+          <w:numId w:val="14"/>
+        </w:numPr>
+        <w:spacing w:line="240" w:lineRule="auto"/>
+        <w:rPr>
+          <w:sz w:val="26"/>
+          <w:szCs w:val="26"/>
+        </w:rPr>
+      </w:pPr>
+      <w:r>
+        <w:rPr>
+          <w:sz w:val="26"/>
+          <w:szCs w:val="26"/>
+        </w:rPr>
+        <w:t xml:space="preserve">The loop body executes </w:t>
+      </w:r>
+      <w:r>
+        <w:rPr>
+          <w:b/>
+          <w:bCs/>
+          <w:sz w:val="26"/>
+          <w:szCs w:val="26"/>
+        </w:rPr>
+        <w:t>at least once</w:t>
+      </w:r>
+      <w:r>
+        <w:rPr>
+          <w:sz w:val="26"/>
+          <w:szCs w:val="26"/>
+        </w:rPr>
+        <w:t xml:space="preserve">. </w:t>
+      </w:r>
+      <w:r>
+        <w:rPr>
+          <w:sz w:val="26"/>
+          <w:szCs w:val="26"/>
+        </w:rPr>
+        <w:t xml:space="preserve">  </w:t>
+      </w:r>
+    </w:p>
+    <w:p>
+      <w:pPr>
+        <w:pStyle w:val="ListParagraph"/>
+        <w:numPr>
+          <w:ilvl w:val="0"/>
+          <w:numId w:val="14"/>
+        </w:numPr>
+        <w:spacing w:line="240" w:lineRule="auto"/>
+        <w:rPr>
+          <w:sz w:val="26"/>
+          <w:szCs w:val="26"/>
+        </w:rPr>
+      </w:pPr>
+      <w:r>
+        <w:rPr>
+          <w:sz w:val="26"/>
+          <w:szCs w:val="26"/>
+        </w:rPr>
+        <w:t xml:space="preserve">The condition is checked </w:t>
+      </w:r>
+      <w:r>
+        <w:rPr>
+          <w:b/>
+          <w:bCs/>
+          <w:sz w:val="26"/>
+          <w:szCs w:val="26"/>
+        </w:rPr>
+        <w:t>after</w:t>
+      </w:r>
+      <w:r>
+        <w:rPr>
+          <w:sz w:val="26"/>
+          <w:szCs w:val="26"/>
+        </w:rPr>
+        <w:t xml:space="preserve"> execution. </w:t>
+      </w:r>
+    </w:p>
+    <w:p>
+      <w:pPr>
+        <w:pStyle w:val="ListParagraph"/>
+        <w:numPr>
+          <w:ilvl w:val="0"/>
+          <w:numId w:val="14"/>
+        </w:numPr>
+        <w:spacing w:line="240" w:lineRule="auto"/>
+        <w:rPr>
+          <w:sz w:val="26"/>
+          <w:szCs w:val="26"/>
+        </w:rPr>
+      </w:pPr>
+      <w:r>
+        <w:rPr>
+          <w:sz w:val="26"/>
+          <w:szCs w:val="26"/>
+        </w:rPr>
+        <w:t xml:space="preserve">Useful when the first execution must always occur. </w:t>
+      </w:r>
+    </w:p>
+    <w:p>
+      <w:pPr>
+        <w:pStyle w:val="ListParagraph"/>
+        <w:numPr>
+          <w:ilvl w:val="0"/>
+          <w:numId w:val="14"/>
+        </w:numPr>
+        <w:spacing w:line="240" w:lineRule="auto"/>
+        <w:rPr>
+          <w:sz w:val="26"/>
+          <w:szCs w:val="26"/>
+        </w:rPr>
+      </w:pPr>
+      <w:r>
+        <w:rPr>
+          <w:sz w:val="26"/>
+          <w:szCs w:val="26"/>
+        </w:rPr>
+        <w:t>Commonly used in menu-driven and input validation programs.</w:t>
+      </w:r>
+    </w:p>
+    <w:p>
+      <w:pPr>
+        <w:pStyle w:val="ListParagraph"/>
+        <w:spacing w:line="480" w:lineRule="auto"/>
+        <w:rPr>
+          <w:b/>
+          <w:bCs/>
+          <w:sz w:val="26"/>
+          <w:szCs w:val="26"/>
+        </w:rPr>
+      </w:pPr>
+    </w:p>
+    <w:p>
+      <w:pPr>
+        <w:pStyle w:val="ListParagraph"/>
+        <w:numPr>
+          <w:ilvl w:val="0"/>
+          <w:numId w:val="2"/>
+        </w:numPr>
+        <w:spacing w:line="480" w:lineRule="auto"/>
+        <w:rPr>
+          <w:b/>
+          <w:bCs/>
+          <w:sz w:val="26"/>
+          <w:szCs w:val="26"/>
+        </w:rPr>
+      </w:pPr>
+      <w:r>
+        <w:rPr>
+          <w:b/>
+          <w:bCs/>
+          <w:sz w:val="26"/>
+          <w:szCs w:val="26"/>
+        </w:rPr>
+        <w:t>Determinate Loops</w:t>
+      </w:r>
+    </w:p>
+    <w:p>
+      <w:pPr>
+        <w:pStyle w:val="pdq2pgselectionanchorcontainer"/>
+        <w:ind w:left="720"/>
+      </w:pPr>
+      <w:r>
+        <w:t xml:space="preserve">A </w:t>
+      </w:r>
+      <w:r>
+        <w:rPr>
+          <w:rStyle w:val="Strong"/>
+        </w:rPr>
+        <w:t>determinate loop</w:t>
+      </w:r>
+      <w:r>
+        <w:t xml:space="preserve"> is a loop in which the </w:t>
+      </w:r>
+      <w:r>
+        <w:rPr>
+          <w:rStyle w:val="Strong"/>
+        </w:rPr>
+        <w:t>number of iterations is known or can be determined before execution begins</w:t>
+      </w:r>
+      <w:r>
+        <w:t>.</w:t>
+      </w:r>
+    </w:p>
+    <w:p>
+      <w:pPr>
+        <w:pStyle w:val="NormalWeb"/>
+        <w:ind w:left="720"/>
+      </w:pPr>
+      <w:r>
+        <w:t xml:space="preserve">In Java, determinate loops are commonly implemented using the </w:t>
+      </w:r>
+      <w:r>
+        <w:rPr>
+          <w:rStyle w:val="HTMLCode"/>
+          <w:b/>
+          <w:bCs/>
+        </w:rPr>
+        <w:t>for</w:t>
+      </w:r>
+      <w:r>
+        <w:rPr>
+          <w:rStyle w:val="Strong"/>
+        </w:rPr>
+        <w:t xml:space="preserve"> loop</w:t>
+      </w:r>
+      <w:r>
+        <w:t>, which is ideal for counter-controlled repetition.</w:t>
+      </w:r>
+    </w:p>
+    <w:p>
+      <w:pPr>
+        <w:pStyle w:val="NormalWeb"/>
+        <w:ind w:left="720"/>
+        <w:rPr>
+          <w:b/>
+          <w:bCs/>
+        </w:rPr>
+      </w:pPr>
+      <w:r>
+        <w:rPr>
+          <w:b/>
+          <w:bCs/>
+        </w:rPr>
+        <w:t>The for Loop</w:t>
+      </w:r>
+    </w:p>
+    <w:p>
+      <w:pPr>
+        <w:pStyle w:val="NormalWeb"/>
+        <w:ind w:left="720"/>
+      </w:pPr>
+      <w:r>
+        <w:t xml:space="preserve">he </w:t>
+      </w:r>
+      <w:r>
+        <w:rPr>
+          <w:b/>
+          <w:bCs/>
+        </w:rPr>
+        <w:t>for loop</w:t>
+      </w:r>
+      <w:r>
+        <w:t xml:space="preserve"> repeatedly executes a block of code while a specified condition remains true. It is primarily used when the program knows how many times a task should be repeated.</w:t>
+      </w:r>
+    </w:p>
+    <w:p>
+      <w:pPr>
+        <w:pStyle w:val="NormalWeb"/>
+        <w:ind w:left="720"/>
+      </w:pPr>
+      <w:r>
+        <w:t>Unlike the while loop, the for loop combines the three essential parts of iteration into one statement:</w:t>
+      </w:r>
+    </w:p>
+    <w:p>
+      <w:pPr>
+        <w:pStyle w:val="NormalWeb"/>
+        <w:numPr>
+          <w:ilvl w:val="0"/>
+          <w:numId w:val="15"/>
+        </w:numPr>
+      </w:pPr>
+      <w:r>
+        <w:t xml:space="preserve">Initialization </w:t>
+      </w:r>
+    </w:p>
+    <w:p>
+      <w:pPr>
+        <w:pStyle w:val="NormalWeb"/>
+        <w:numPr>
+          <w:ilvl w:val="0"/>
+          <w:numId w:val="15"/>
+        </w:numPr>
+      </w:pPr>
+      <w:r>
+        <w:t xml:space="preserve">Condition </w:t>
+      </w:r>
+    </w:p>
+    <w:p>
+      <w:pPr>
+        <w:pStyle w:val="NormalWeb"/>
+        <w:numPr>
+          <w:ilvl w:val="0"/>
+          <w:numId w:val="15"/>
+        </w:numPr>
+      </w:pPr>
+      <w:r>
+        <w:t>Update</w:t>
+      </w:r>
+    </w:p>
+    <w:p>
+      <w:pPr>
+        <w:pStyle w:val="NormalWeb"/>
+      </w:pPr>
+    </w:p>
+    <w:p>
+      <w:pPr>
+        <w:pStyle w:val="NormalWeb"/>
+        <w:ind w:left="720"/>
+      </w:pPr>
+    </w:p>
+    <w:p>
+      <w:pPr>
+        <w:pStyle w:val="NormalWeb"/>
+      </w:pPr>
+      <w:r>
+        <w:rPr>
+          <w:noProof/>
+        </w:rPr>
+        <w:drawing>
+          <wp:inline distT="0" distB="0" distL="0" distR="0" wp14:anchorId="5BE0DC80" wp14:editId="6DE8C5A8">
+            <wp:extent cx="6661150" cy="1819910"/>
+            <wp:effectExtent l="0" t="0" r="6350" b="8890"/>
+            <wp:docPr id="370399230" name="Picture 1"/>
+            <wp:cNvGraphicFramePr>
+              <a:graphicFrameLocks xmlns:a="http://schemas.openxmlformats.org/drawingml/2006/main" noChangeAspect="1"/>
+            </wp:cNvGraphicFramePr>
+            <a:graphic xmlns:a="http://schemas.openxmlformats.org/drawingml/2006/main">
+              <a:graphicData uri="http://schemas.openxmlformats.org/drawingml/2006/picture">
+                <pic:pic xmlns:pic="http://schemas.openxmlformats.org/drawingml/2006/picture">
+                  <pic:nvPicPr>
+                    <pic:cNvPr id="370399230" name=""/>
+                    <pic:cNvPicPr/>
+                  </pic:nvPicPr>
+                  <pic:blipFill>
+                    <a:blip r:embed="rId15"/>
+                    <a:stretch>
+                      <a:fillRect/>
+                    </a:stretch>
+                  </pic:blipFill>
+                  <pic:spPr>
+                    <a:xfrm>
+                      <a:off x="0" y="0"/>
+                      <a:ext cx="6661150" cy="1819910"/>
+                    </a:xfrm>
+                    <a:prstGeom prst="rect">
+                      <a:avLst/>
+                    </a:prstGeom>
+                  </pic:spPr>
+                </pic:pic>
+              </a:graphicData>
+            </a:graphic>
+          </wp:inline>
+        </w:drawing>
+      </w:r>
+    </w:p>
+    <w:p>
+      <w:pPr>
+        <w:spacing w:line="480" w:lineRule="auto"/>
+        <w:rPr>
+          <w:b/>
+          <w:bCs/>
+          <w:sz w:val="26"/>
+          <w:szCs w:val="26"/>
+        </w:rPr>
+      </w:pPr>
+      <w:r>
+        <w:rPr>
+          <w:b/>
+          <w:bCs/>
+          <w:sz w:val="26"/>
+          <w:szCs w:val="26"/>
+        </w:rPr>
+        <w:t>How the for Loop Works</w:t>
+      </w:r>
+    </w:p>
+    <w:p>
+      <w:pPr>
+        <w:spacing w:line="240" w:lineRule="auto"/>
+        <w:rPr>
+          <w:sz w:val="26"/>
+          <w:szCs w:val="26"/>
+        </w:rPr>
+      </w:pPr>
+      <w:r>
+        <w:rPr>
+          <w:sz w:val="26"/>
+          <w:szCs w:val="26"/>
+        </w:rPr>
+        <w:t>The execution order is:</w:t>
+      </w:r>
+    </w:p>
+    <w:p>
+      <w:pPr>
+        <w:numPr>
+          <w:ilvl w:val="0"/>
+          <w:numId w:val="16"/>
+        </w:numPr>
+        <w:spacing w:line="240" w:lineRule="auto"/>
+        <w:rPr>
+          <w:sz w:val="26"/>
+          <w:szCs w:val="26"/>
+        </w:rPr>
+      </w:pPr>
+      <w:r>
+        <w:rPr>
+          <w:sz w:val="26"/>
+          <w:szCs w:val="26"/>
+        </w:rPr>
+        <w:t xml:space="preserve">Execute the initialization once. </w:t>
+      </w:r>
+    </w:p>
+    <w:p>
+      <w:pPr>
+        <w:numPr>
+          <w:ilvl w:val="0"/>
+          <w:numId w:val="16"/>
+        </w:numPr>
+        <w:spacing w:line="240" w:lineRule="auto"/>
+        <w:rPr>
+          <w:sz w:val="26"/>
+          <w:szCs w:val="26"/>
+        </w:rPr>
+      </w:pPr>
+      <w:r>
+        <w:rPr>
+          <w:sz w:val="26"/>
+          <w:szCs w:val="26"/>
+        </w:rPr>
+        <w:t xml:space="preserve">Check the condition. </w:t>
+      </w:r>
+    </w:p>
+    <w:p>
+      <w:pPr>
+        <w:numPr>
+          <w:ilvl w:val="0"/>
+          <w:numId w:val="16"/>
+        </w:numPr>
+        <w:spacing w:line="240" w:lineRule="auto"/>
+        <w:rPr>
+          <w:sz w:val="26"/>
+          <w:szCs w:val="26"/>
+        </w:rPr>
+      </w:pPr>
+      <w:r>
+        <w:rPr>
+          <w:sz w:val="26"/>
+          <w:szCs w:val="26"/>
+        </w:rPr>
+        <w:t xml:space="preserve">Execute the loop body if the condition is true. </w:t>
+      </w:r>
+    </w:p>
+    <w:p>
+      <w:pPr>
+        <w:numPr>
+          <w:ilvl w:val="0"/>
+          <w:numId w:val="16"/>
+        </w:numPr>
+        <w:spacing w:line="240" w:lineRule="auto"/>
+        <w:rPr>
+          <w:sz w:val="26"/>
+          <w:szCs w:val="26"/>
+        </w:rPr>
+      </w:pPr>
+      <w:r>
+        <w:rPr>
+          <w:sz w:val="26"/>
+          <w:szCs w:val="26"/>
+        </w:rPr>
+        <w:t xml:space="preserve">Execute the update expression. </w:t>
+      </w:r>
+    </w:p>
+    <w:p>
+      <w:pPr>
+        <w:numPr>
+          <w:ilvl w:val="0"/>
+          <w:numId w:val="16"/>
+        </w:numPr>
+        <w:spacing w:line="240" w:lineRule="auto"/>
+        <w:rPr>
+          <w:sz w:val="26"/>
+          <w:szCs w:val="26"/>
+        </w:rPr>
+      </w:pPr>
+      <w:r>
+        <w:rPr>
+          <w:sz w:val="26"/>
+          <w:szCs w:val="26"/>
+        </w:rPr>
+        <w:t>Repeat from Step 2.</w:t>
+      </w:r>
+    </w:p>
+    <w:p>
+      <w:pPr>
+        <w:spacing w:line="480" w:lineRule="auto"/>
+        <w:rPr>
+          <w:rFonts w:hint="cs"/>
+          <w:sz w:val="26"/>
+          <w:szCs w:val="26"/>
+          <w:rtl/>
+          <w:lang w:bidi="ar-DZ"/>
+        </w:rPr>
+      </w:pPr>
+    </w:p>
+    <w:p>
+      <w:pPr>
+        <w:pStyle w:val="ListParagraph"/>
+        <w:numPr>
+          <w:ilvl w:val="0"/>
+          <w:numId w:val="2"/>
+        </w:numPr>
+        <w:spacing w:line="480" w:lineRule="auto"/>
+        <w:rPr>
+          <w:b/>
+          <w:bCs/>
+          <w:sz w:val="26"/>
+          <w:szCs w:val="26"/>
+        </w:rPr>
+      </w:pPr>
+      <w:r>
+        <w:rPr>
+          <w:b/>
+          <w:bCs/>
+          <w:sz w:val="26"/>
+          <w:szCs w:val="26"/>
+        </w:rPr>
+        <w:t>Multiple Selections with switch</w:t>
+      </w:r>
+    </w:p>
+    <w:p>
+      <w:pPr>
+        <w:pStyle w:val="pdq2pgselectionanchorcontainer"/>
+        <w:ind w:left="1080"/>
+      </w:pPr>
+      <w:r>
+        <w:t xml:space="preserve">A </w:t>
+      </w:r>
+      <w:r>
+        <w:rPr>
+          <w:rStyle w:val="HTMLCode"/>
+          <w:b/>
+          <w:bCs/>
+        </w:rPr>
+        <w:t>switch</w:t>
+      </w:r>
+      <w:r>
+        <w:t xml:space="preserve"> is a multi-way selection structure that evaluates a single expression and executes the block of code associated with the matching case.</w:t>
+      </w:r>
+    </w:p>
+    <w:p>
+      <w:pPr>
+        <w:pStyle w:val="NormalWeb"/>
+        <w:ind w:left="1080"/>
+        <w:rPr>
+          <w:rtl/>
+        </w:rPr>
+      </w:pPr>
+      <w:r>
+        <w:t xml:space="preserve">Instead of writing multiple </w:t>
+      </w:r>
+      <w:r>
+        <w:rPr>
+          <w:rStyle w:val="HTMLCode"/>
+        </w:rPr>
+        <w:t>if...else if</w:t>
+      </w:r>
+      <w:r>
+        <w:t xml:space="preserve"> statements, </w:t>
+      </w:r>
+      <w:r>
+        <w:rPr>
+          <w:rStyle w:val="HTMLCode"/>
+        </w:rPr>
+        <w:t>switch</w:t>
+      </w:r>
+      <w:r>
+        <w:t xml:space="preserve"> provides a cleaner and more organized way to select one action from many alternatives.</w:t>
+      </w:r>
+    </w:p>
+    <w:p>
+      <w:pPr>
+        <w:pStyle w:val="NormalWeb"/>
+        <w:ind w:left="1080"/>
+        <w:rPr>
+          <w:b/>
+          <w:bCs/>
+        </w:rPr>
+      </w:pPr>
+      <w:r>
+        <w:rPr>
+          <w:b/>
+          <w:bCs/>
+        </w:rPr>
+        <w:t>Why Use switch?</w:t>
+      </w:r>
+    </w:p>
+    <w:p>
+      <w:pPr>
+        <w:pStyle w:val="NormalWeb"/>
+        <w:ind w:left="1080"/>
+      </w:pPr>
+      <w:r>
+        <w:t>Use a switch statement when:</w:t>
+      </w:r>
+    </w:p>
+    <w:p>
+      <w:pPr>
+        <w:pStyle w:val="NormalWeb"/>
+        <w:numPr>
+          <w:ilvl w:val="0"/>
+          <w:numId w:val="17"/>
+        </w:numPr>
+      </w:pPr>
+      <w:r>
+        <w:t xml:space="preserve">Comparing </w:t>
+      </w:r>
+      <w:r>
+        <w:rPr>
+          <w:b/>
+          <w:bCs/>
+        </w:rPr>
+        <w:t>one variable</w:t>
+      </w:r>
+      <w:r>
+        <w:t xml:space="preserve"> against many possible values. </w:t>
+      </w:r>
+    </w:p>
+    <w:p>
+      <w:pPr>
+        <w:pStyle w:val="NormalWeb"/>
+        <w:numPr>
+          <w:ilvl w:val="0"/>
+          <w:numId w:val="17"/>
+        </w:numPr>
+      </w:pPr>
+      <w:r>
+        <w:t xml:space="preserve">Building menu-driven applications. </w:t>
+      </w:r>
+    </w:p>
+    <w:p>
+      <w:pPr>
+        <w:pStyle w:val="NormalWeb"/>
+        <w:numPr>
+          <w:ilvl w:val="0"/>
+          <w:numId w:val="17"/>
+        </w:numPr>
+      </w:pPr>
+      <w:r>
+        <w:t xml:space="preserve">Processing user commands. </w:t>
+      </w:r>
+    </w:p>
+    <w:p>
+      <w:pPr>
+        <w:pStyle w:val="NormalWeb"/>
+        <w:numPr>
+          <w:ilvl w:val="0"/>
+          <w:numId w:val="17"/>
+        </w:numPr>
+      </w:pPr>
+      <w:r>
+        <w:t xml:space="preserve">Handling different states or options. </w:t>
+      </w:r>
+    </w:p>
+    <w:p>
+      <w:pPr>
+        <w:pStyle w:val="NormalWeb"/>
+        <w:numPr>
+          <w:ilvl w:val="0"/>
+          <w:numId w:val="17"/>
+        </w:numPr>
+      </w:pPr>
+      <w:r>
+        <w:t xml:space="preserve">Improving readability compared to long if...else if chains. </w:t>
+      </w:r>
+    </w:p>
+    <w:p>
+      <w:pPr>
+        <w:pStyle w:val="NormalWeb"/>
+      </w:pPr>
+    </w:p>
+    <w:p>
+      <w:pPr>
+        <w:pStyle w:val="NormalWeb"/>
+      </w:pPr>
+    </w:p>
+    <w:p>
+      <w:pPr>
+        <w:pStyle w:val="NormalWeb"/>
+      </w:pPr>
+    </w:p>
+    <w:p>
+      <w:pPr>
+        <w:pStyle w:val="NormalWeb"/>
+      </w:pPr>
+      <w:r>
+        <w:rPr>
+          <w:noProof/>
+        </w:rPr>
+        <w:lastRenderedPageBreak/>
+        <w:drawing>
+          <wp:inline distT="0" distB="0" distL="0" distR="0" wp14:anchorId="2DFF2651" wp14:editId="55505955">
+            <wp:extent cx="6661150" cy="2995295"/>
+            <wp:effectExtent l="0" t="0" r="6350" b="0"/>
+            <wp:docPr id="1826829663" name="Picture 1"/>
+            <wp:cNvGraphicFramePr>
+              <a:graphicFrameLocks xmlns:a="http://schemas.openxmlformats.org/drawingml/2006/main" noChangeAspect="1"/>
+            </wp:cNvGraphicFramePr>
+            <a:graphic xmlns:a="http://schemas.openxmlformats.org/drawingml/2006/main">
+              <a:graphicData uri="http://schemas.openxmlformats.org/drawingml/2006/picture">
+                <pic:pic xmlns:pic="http://schemas.openxmlformats.org/drawingml/2006/picture">
+                  <pic:nvPicPr>
+                    <pic:cNvPr id="1826829663" name=""/>
+                    <pic:cNvPicPr/>
+                  </pic:nvPicPr>
+                  <pic:blipFill>
+                    <a:blip r:embed="rId16"/>
+                    <a:stretch>
+                      <a:fillRect/>
+                    </a:stretch>
+                  </pic:blipFill>
+                  <pic:spPr>
+                    <a:xfrm>
+                      <a:off x="0" y="0"/>
+                      <a:ext cx="6661150" cy="2995295"/>
+                    </a:xfrm>
+                    <a:prstGeom prst="rect">
+                      <a:avLst/>
+                    </a:prstGeom>
+                  </pic:spPr>
+                </pic:pic>
+              </a:graphicData>
+            </a:graphic>
+          </wp:inline>
+        </w:drawing>
+      </w:r>
+    </w:p>
+    <w:p>
+      <w:pPr>
+        <w:pStyle w:val="ListParagraph"/>
+        <w:numPr>
+          <w:ilvl w:val="0"/>
+          <w:numId w:val="2"/>
+        </w:numPr>
+        <w:spacing w:line="480" w:lineRule="auto"/>
+        <w:rPr>
+          <w:b/>
+          <w:bCs/>
+          <w:sz w:val="26"/>
+          <w:szCs w:val="26"/>
+        </w:rPr>
+      </w:pPr>
+      <w:r>
+        <w:rPr>
+          <w:b/>
+          <w:bCs/>
+          <w:sz w:val="26"/>
+          <w:szCs w:val="26"/>
+        </w:rPr>
+        <w:t>Statements That Break Control Flow</w:t>
+      </w:r>
+    </w:p>
+    <w:p>
+      <w:pPr>
+        <w:pStyle w:val="ListParagraph"/>
+        <w:spacing w:before="100" w:beforeAutospacing="1" w:after="100" w:afterAutospacing="1" w:line="240" w:lineRule="auto"/>
+        <w:ind w:left="1080"/>
+        <w:rPr>
+          <w:rFonts w:ascii="Times New Roman" w:eastAsia="Times New Roman" w:hAnsi="Times New Roman" w:cs="Times New Roman"/>
+          <w:kern w:val="0"/>
+          <w:sz w:val="24"/>
+          <w:szCs w:val="24"/>
+          <w:lang w:eastAsia="en-AE"/>
+          <w14:ligatures w14:val="none"/>
+        </w:rPr>
+      </w:pPr>
+      <w:r>
+        <w:rPr>
+          <w:rFonts w:ascii="Times New Roman" w:eastAsia="Times New Roman" w:hAnsi="Times New Roman" w:cs="Times New Roman"/>
+          <w:kern w:val="0"/>
+          <w:sz w:val="24"/>
+          <w:szCs w:val="24"/>
+          <w:lang w:eastAsia="en-AE"/>
+          <w14:ligatures w14:val="none"/>
+        </w:rPr>
+        <w:t xml:space="preserve">The </w:t>
+      </w:r>
+      <w:r>
+        <w:rPr>
+          <w:rFonts w:ascii="Courier New" w:eastAsia="Times New Roman" w:hAnsi="Courier New" w:cs="Courier New"/>
+          <w:b/>
+          <w:bCs/>
+          <w:kern w:val="0"/>
+          <w:sz w:val="20"/>
+          <w:szCs w:val="20"/>
+          <w:lang w:eastAsia="en-AE"/>
+          <w14:ligatures w14:val="none"/>
+        </w:rPr>
+        <w:t>break</w:t>
+      </w:r>
+      <w:r>
+        <w:rPr>
+          <w:rFonts w:ascii="Times New Roman" w:eastAsia="Times New Roman" w:hAnsi="Times New Roman" w:cs="Times New Roman"/>
+          <w:kern w:val="0"/>
+          <w:sz w:val="24"/>
+          <w:szCs w:val="24"/>
+          <w:lang w:eastAsia="en-AE"/>
+          <w14:ligatures w14:val="none"/>
+        </w:rPr>
+        <w:t xml:space="preserve"> statement immediately terminates the current </w:t>
+      </w:r>
+      <w:r>
+        <w:rPr>
+          <w:rFonts w:ascii="Courier New" w:eastAsia="Times New Roman" w:hAnsi="Courier New" w:cs="Courier New"/>
+          <w:kern w:val="0"/>
+          <w:sz w:val="20"/>
+          <w:szCs w:val="20"/>
+          <w:lang w:eastAsia="en-AE"/>
+          <w14:ligatures w14:val="none"/>
+        </w:rPr>
+        <w:t>switch</w:t>
+      </w:r>
+      <w:r>
+        <w:rPr>
+          <w:rFonts w:ascii="Times New Roman" w:eastAsia="Times New Roman" w:hAnsi="Times New Roman" w:cs="Times New Roman"/>
+          <w:kern w:val="0"/>
+          <w:sz w:val="24"/>
+          <w:szCs w:val="24"/>
+          <w:lang w:eastAsia="en-AE"/>
+          <w14:ligatures w14:val="none"/>
+        </w:rPr>
+        <w:t xml:space="preserve"> case or loop.</w:t>
+      </w:r>
+    </w:p>
+    <w:p>
+      <w:pPr>
+        <w:pStyle w:val="ListParagraph"/>
+        <w:spacing w:before="100" w:beforeAutospacing="1" w:after="100" w:afterAutospacing="1" w:line="240" w:lineRule="auto"/>
+        <w:ind w:left="1080"/>
+        <w:rPr>
+          <w:rFonts w:ascii="Times New Roman" w:eastAsia="Times New Roman" w:hAnsi="Times New Roman" w:cs="Times New Roman"/>
+          <w:kern w:val="0"/>
+          <w:sz w:val="24"/>
+          <w:szCs w:val="24"/>
+          <w:lang w:eastAsia="en-AE"/>
+          <w14:ligatures w14:val="none"/>
+        </w:rPr>
+      </w:pPr>
+      <w:r>
+        <w:rPr>
+          <w:rFonts w:ascii="Times New Roman" w:eastAsia="Times New Roman" w:hAnsi="Times New Roman" w:cs="Times New Roman"/>
+          <w:kern w:val="0"/>
+          <w:sz w:val="24"/>
+          <w:szCs w:val="24"/>
+          <w:lang w:eastAsia="en-AE"/>
+          <w14:ligatures w14:val="none"/>
+        </w:rPr>
+        <w:t xml:space="preserve">Without </w:t>
+      </w:r>
+      <w:r>
+        <w:rPr>
+          <w:rFonts w:ascii="Courier New" w:eastAsia="Times New Roman" w:hAnsi="Courier New" w:cs="Courier New"/>
+          <w:kern w:val="0"/>
+          <w:sz w:val="20"/>
+          <w:szCs w:val="20"/>
+          <w:lang w:eastAsia="en-AE"/>
+          <w14:ligatures w14:val="none"/>
+        </w:rPr>
+        <w:t>break</w:t>
+      </w:r>
+      <w:r>
+        <w:rPr>
+          <w:rFonts w:ascii="Times New Roman" w:eastAsia="Times New Roman" w:hAnsi="Times New Roman" w:cs="Times New Roman"/>
+          <w:kern w:val="0"/>
+          <w:sz w:val="24"/>
+          <w:szCs w:val="24"/>
+          <w:lang w:eastAsia="en-AE"/>
+          <w14:ligatures w14:val="none"/>
+        </w:rPr>
+        <w:t xml:space="preserve">, execution continues into the next case. This behavior is known as </w:t>
+      </w:r>
+      <w:r>
+        <w:rPr>
+          <w:rFonts w:ascii="Times New Roman" w:eastAsia="Times New Roman" w:hAnsi="Times New Roman" w:cs="Times New Roman"/>
+          <w:b/>
+          <w:bCs/>
+          <w:kern w:val="0"/>
+          <w:sz w:val="24"/>
+          <w:szCs w:val="24"/>
+          <w:lang w:eastAsia="en-AE"/>
+          <w14:ligatures w14:val="none"/>
+        </w:rPr>
+        <w:t>fall-through</w:t>
+      </w:r>
+      <w:r>
+        <w:rPr>
+          <w:rFonts w:ascii="Times New Roman" w:eastAsia="Times New Roman" w:hAnsi="Times New Roman" w:cs="Times New Roman"/>
+          <w:kern w:val="0"/>
+          <w:sz w:val="24"/>
+          <w:szCs w:val="24"/>
+          <w:lang w:eastAsia="en-AE"/>
+          <w14:ligatures w14:val="none"/>
+        </w:rPr>
+        <w:t>.</w:t>
+      </w:r>
+    </w:p>
+    <w:p>
+      <w:pPr>
+        <w:pStyle w:val="ListParagraph"/>
+        <w:spacing w:before="100" w:beforeAutospacing="1" w:after="100" w:afterAutospacing="1" w:line="240" w:lineRule="auto"/>
+        <w:ind w:left="1080"/>
+        <w:rPr>
+          <w:rFonts w:ascii="Times New Roman" w:eastAsia="Times New Roman" w:hAnsi="Times New Roman" w:cs="Times New Roman"/>
+          <w:b/>
+          <w:bCs/>
+          <w:kern w:val="0"/>
+          <w:sz w:val="24"/>
+          <w:szCs w:val="24"/>
+          <w:lang w:eastAsia="en-AE"/>
+          <w14:ligatures w14:val="none"/>
+        </w:rPr>
+      </w:pPr>
+    </w:p>
+    <w:p>
+      <w:pPr>
+        <w:pStyle w:val="ListParagraph"/>
+        <w:spacing w:before="100" w:beforeAutospacing="1" w:after="100" w:afterAutospacing="1" w:line="240" w:lineRule="auto"/>
+        <w:ind w:left="1080"/>
+        <w:rPr>
+          <w:rFonts w:ascii="Times New Roman" w:eastAsia="Times New Roman" w:hAnsi="Times New Roman" w:cs="Times New Roman"/>
+          <w:b/>
+          <w:bCs/>
+          <w:kern w:val="0"/>
+          <w:sz w:val="24"/>
+          <w:szCs w:val="24"/>
+          <w:lang w:eastAsia="en-AE"/>
+          <w14:ligatures w14:val="none"/>
+        </w:rPr>
+      </w:pPr>
+      <w:r>
+        <w:rPr>
+          <w:rFonts w:ascii="Times New Roman" w:eastAsia="Times New Roman" w:hAnsi="Times New Roman" w:cs="Times New Roman"/>
+          <w:b/>
+          <w:bCs/>
+          <w:kern w:val="0"/>
+          <w:sz w:val="24"/>
+          <w:szCs w:val="24"/>
+          <w:lang w:eastAsia="en-AE"/>
+          <w14:ligatures w14:val="none"/>
+        </w:rPr>
+        <w:t>Switch Expressions</w:t>
+      </w:r>
+    </w:p>
+    <w:p>
+      <w:pPr>
+        <w:pStyle w:val="ListParagraph"/>
+        <w:spacing w:before="100" w:beforeAutospacing="1" w:after="100" w:afterAutospacing="1" w:line="240" w:lineRule="auto"/>
+        <w:ind w:left="1080"/>
+        <w:rPr>
+          <w:rFonts w:ascii="Times New Roman" w:eastAsia="Times New Roman" w:hAnsi="Times New Roman" w:cs="Times New Roman"/>
+          <w:kern w:val="0"/>
+          <w:sz w:val="24"/>
+          <w:szCs w:val="24"/>
+          <w:lang w:eastAsia="en-AE"/>
+          <w14:ligatures w14:val="none"/>
+        </w:rPr>
+      </w:pPr>
+      <w:r>
+        <w:rPr>
+          <w:rFonts w:ascii="Times New Roman" w:eastAsia="Times New Roman" w:hAnsi="Times New Roman" w:cs="Times New Roman"/>
+          <w:kern w:val="0"/>
+          <w:sz w:val="24"/>
+          <w:szCs w:val="24"/>
+          <w:lang w:eastAsia="en-AE"/>
+          <w14:ligatures w14:val="none"/>
+        </w:rPr>
+        <w:t xml:space="preserve">A </w:t>
+      </w:r>
+      <w:r>
+        <w:rPr>
+          <w:rFonts w:ascii="Times New Roman" w:eastAsia="Times New Roman" w:hAnsi="Times New Roman" w:cs="Times New Roman"/>
+          <w:b/>
+          <w:bCs/>
+          <w:kern w:val="0"/>
+          <w:sz w:val="24"/>
+          <w:szCs w:val="24"/>
+          <w:lang w:eastAsia="en-AE"/>
+          <w14:ligatures w14:val="none"/>
+        </w:rPr>
+        <w:t>switch expression</w:t>
+      </w:r>
+      <w:r>
+        <w:rPr>
+          <w:rFonts w:ascii="Times New Roman" w:eastAsia="Times New Roman" w:hAnsi="Times New Roman" w:cs="Times New Roman"/>
+          <w:kern w:val="0"/>
+          <w:sz w:val="24"/>
+          <w:szCs w:val="24"/>
+          <w:lang w:eastAsia="en-AE"/>
+          <w14:ligatures w14:val="none"/>
+        </w:rPr>
+        <w:t xml:space="preserve"> returns a value instead of simply executing statements.</w:t>
+      </w:r>
+    </w:p>
+    <w:p>
+      <w:pPr>
+        <w:pStyle w:val="ListParagraph"/>
+        <w:spacing w:before="100" w:beforeAutospacing="1" w:after="100" w:afterAutospacing="1" w:line="240" w:lineRule="auto"/>
+        <w:ind w:left="1080"/>
+        <w:rPr>
+          <w:rFonts w:ascii="Times New Roman" w:eastAsia="Times New Roman" w:hAnsi="Times New Roman" w:cs="Times New Roman"/>
+          <w:kern w:val="0"/>
+          <w:sz w:val="24"/>
+          <w:szCs w:val="24"/>
+          <w:lang w:eastAsia="en-AE"/>
+          <w14:ligatures w14:val="none"/>
+        </w:rPr>
+      </w:pPr>
+    </w:p>
+    <w:p>
+      <w:pPr>
+        <w:pStyle w:val="ListParagraph"/>
+        <w:spacing w:before="100" w:beforeAutospacing="1" w:after="100" w:afterAutospacing="1" w:line="240" w:lineRule="auto"/>
+        <w:ind w:left="1080"/>
+        <w:rPr>
+          <w:rFonts w:ascii="Times New Roman" w:eastAsia="Times New Roman" w:hAnsi="Times New Roman" w:cs="Times New Roman"/>
+          <w:b/>
+          <w:bCs/>
+          <w:kern w:val="0"/>
+          <w:sz w:val="24"/>
+          <w:szCs w:val="24"/>
+          <w:lang w:eastAsia="en-AE"/>
+          <w14:ligatures w14:val="none"/>
+        </w:rPr>
+      </w:pPr>
+      <w:r>
+        <w:rPr>
+          <w:rFonts w:ascii="Times New Roman" w:eastAsia="Times New Roman" w:hAnsi="Times New Roman" w:cs="Times New Roman"/>
+          <w:b/>
+          <w:bCs/>
+          <w:kern w:val="0"/>
+          <w:sz w:val="24"/>
+          <w:szCs w:val="24"/>
+          <w:lang w:eastAsia="en-AE"/>
+          <w14:ligatures w14:val="none"/>
+        </w:rPr>
+        <w:t>The break Statement</w:t>
+      </w:r>
+    </w:p>
+    <w:p>
+      <w:pPr>
+        <w:pStyle w:val="ListParagraph"/>
+        <w:ind w:left="1080"/>
+        <w:rPr>
+          <w:rFonts w:ascii="Times New Roman" w:eastAsia="Times New Roman" w:hAnsi="Times New Roman" w:cs="Times New Roman"/>
+          <w:kern w:val="0"/>
+          <w:sz w:val="24"/>
+          <w:szCs w:val="24"/>
+          <w:lang w:eastAsia="en-AE"/>
+          <w14:ligatures w14:val="none"/>
+        </w:rPr>
+      </w:pPr>
+      <w:r>
+        <w:rPr>
+          <w:rFonts w:ascii="Times New Roman" w:eastAsia="Times New Roman" w:hAnsi="Times New Roman" w:cs="Times New Roman"/>
+          <w:kern w:val="0"/>
+          <w:sz w:val="24"/>
+          <w:szCs w:val="24"/>
+          <w:lang w:eastAsia="en-AE"/>
+          <w14:ligatures w14:val="none"/>
+        </w:rPr>
+        <w:t xml:space="preserve">The </w:t>
+      </w:r>
+      <w:r>
+        <w:rPr>
+          <w:rFonts w:ascii="Times New Roman" w:eastAsia="Times New Roman" w:hAnsi="Times New Roman" w:cs="Times New Roman"/>
+          <w:b/>
+          <w:bCs/>
+          <w:kern w:val="0"/>
+          <w:sz w:val="24"/>
+          <w:szCs w:val="24"/>
+          <w:lang w:eastAsia="en-AE"/>
+          <w14:ligatures w14:val="none"/>
+        </w:rPr>
+        <w:t>break</w:t>
+      </w:r>
+      <w:r>
+        <w:rPr>
+          <w:rFonts w:ascii="Times New Roman" w:eastAsia="Times New Roman" w:hAnsi="Times New Roman" w:cs="Times New Roman"/>
+          <w:kern w:val="0"/>
+          <w:sz w:val="24"/>
+          <w:szCs w:val="24"/>
+          <w:lang w:eastAsia="en-AE"/>
+          <w14:ligatures w14:val="none"/>
+        </w:rPr>
+        <w:t xml:space="preserve"> statement immediately exits the nearest loop or switch statement.</w:t>
+      </w:r>
+    </w:p>
+    <w:p>
+      <w:pPr>
+        <w:pStyle w:val="ListParagraph"/>
+        <w:spacing w:before="100" w:beforeAutospacing="1" w:after="100" w:afterAutospacing="1" w:line="240" w:lineRule="auto"/>
+        <w:ind w:left="1080"/>
+        <w:rPr>
+          <w:rFonts w:ascii="Times New Roman" w:eastAsia="Times New Roman" w:hAnsi="Times New Roman" w:cs="Times New Roman"/>
+          <w:kern w:val="0"/>
+          <w:sz w:val="24"/>
+          <w:szCs w:val="24"/>
+          <w:lang w:eastAsia="en-AE"/>
+          <w14:ligatures w14:val="none"/>
+        </w:rPr>
+      </w:pPr>
+    </w:p>
+    <w:p>
+      <w:pPr>
+        <w:pStyle w:val="ListParagraph"/>
+        <w:spacing w:before="100" w:beforeAutospacing="1" w:after="100" w:afterAutospacing="1" w:line="240" w:lineRule="auto"/>
+        <w:ind w:left="1080"/>
+        <w:rPr>
+          <w:rFonts w:ascii="Times New Roman" w:eastAsia="Times New Roman" w:hAnsi="Times New Roman" w:cs="Times New Roman"/>
+          <w:b/>
+          <w:bCs/>
+          <w:kern w:val="0"/>
+          <w:sz w:val="24"/>
+          <w:szCs w:val="24"/>
+          <w:lang w:eastAsia="en-AE"/>
+          <w14:ligatures w14:val="none"/>
+        </w:rPr>
+      </w:pPr>
+      <w:r>
+        <w:rPr>
+          <w:rFonts w:ascii="Times New Roman" w:eastAsia="Times New Roman" w:hAnsi="Times New Roman" w:cs="Times New Roman"/>
+          <w:b/>
+          <w:bCs/>
+          <w:kern w:val="0"/>
+          <w:sz w:val="24"/>
+          <w:szCs w:val="24"/>
+          <w:lang w:eastAsia="en-AE"/>
+          <w14:ligatures w14:val="none"/>
+        </w:rPr>
+        <w:t>Labeled break</w:t>
+      </w:r>
+    </w:p>
+    <w:p>
+      <w:pPr>
+        <w:pStyle w:val="ListParagraph"/>
+        <w:spacing w:before="100" w:beforeAutospacing="1" w:after="100" w:afterAutospacing="1" w:line="240" w:lineRule="auto"/>
+        <w:ind w:left="1080"/>
+        <w:rPr>
+          <w:rFonts w:ascii="Times New Roman" w:eastAsia="Times New Roman" w:hAnsi="Times New Roman" w:cs="Times New Roman"/>
+          <w:kern w:val="0"/>
+          <w:sz w:val="24"/>
+          <w:szCs w:val="24"/>
+          <w:lang w:eastAsia="en-AE"/>
+          <w14:ligatures w14:val="none"/>
+        </w:rPr>
+      </w:pPr>
+      <w:r>
+        <w:rPr>
+          <w:rFonts w:ascii="Times New Roman" w:eastAsia="Times New Roman" w:hAnsi="Times New Roman" w:cs="Times New Roman"/>
+          <w:kern w:val="0"/>
+          <w:sz w:val="24"/>
+          <w:szCs w:val="24"/>
+          <w:lang w:eastAsia="en-AE"/>
+          <w14:ligatures w14:val="none"/>
+        </w:rPr>
+        <w:t xml:space="preserve">A </w:t>
+      </w:r>
+      <w:r>
+        <w:rPr>
+          <w:rFonts w:ascii="Times New Roman" w:eastAsia="Times New Roman" w:hAnsi="Times New Roman" w:cs="Times New Roman"/>
+          <w:b/>
+          <w:bCs/>
+          <w:kern w:val="0"/>
+          <w:sz w:val="24"/>
+          <w:szCs w:val="24"/>
+          <w:lang w:eastAsia="en-AE"/>
+          <w14:ligatures w14:val="none"/>
+        </w:rPr>
+        <w:t>labeled break</w:t>
+      </w:r>
+      <w:r>
+        <w:rPr>
+          <w:rFonts w:ascii="Times New Roman" w:eastAsia="Times New Roman" w:hAnsi="Times New Roman" w:cs="Times New Roman"/>
+          <w:kern w:val="0"/>
+          <w:sz w:val="24"/>
+          <w:szCs w:val="24"/>
+          <w:lang w:eastAsia="en-AE"/>
+          <w14:ligatures w14:val="none"/>
+        </w:rPr>
+        <w:t xml:space="preserve"> exits multiple nested loops at once.</w:t>
+      </w:r>
+    </w:p>
+    <w:p>
+      <w:pPr>
+        <w:pStyle w:val="ListParagraph"/>
+        <w:spacing w:before="100" w:beforeAutospacing="1" w:after="100" w:afterAutospacing="1" w:line="240" w:lineRule="auto"/>
+        <w:ind w:left="1080"/>
+        <w:rPr>
+          <w:rFonts w:ascii="Times New Roman" w:eastAsia="Times New Roman" w:hAnsi="Times New Roman" w:cs="Times New Roman"/>
+          <w:b/>
+          <w:bCs/>
+          <w:kern w:val="0"/>
+          <w:sz w:val="24"/>
+          <w:szCs w:val="24"/>
+          <w:lang w:eastAsia="en-AE"/>
+          <w14:ligatures w14:val="none"/>
+        </w:rPr>
+      </w:pPr>
+    </w:p>
+    <w:p>
+      <w:pPr>
+        <w:pStyle w:val="ListParagraph"/>
+        <w:spacing w:before="100" w:beforeAutospacing="1" w:after="100" w:afterAutospacing="1" w:line="240" w:lineRule="auto"/>
+        <w:ind w:left="1080"/>
+        <w:rPr>
+          <w:rFonts w:ascii="Times New Roman" w:eastAsia="Times New Roman" w:hAnsi="Times New Roman" w:cs="Times New Roman"/>
+          <w:b/>
+          <w:bCs/>
+          <w:kern w:val="0"/>
+          <w:sz w:val="24"/>
+          <w:szCs w:val="24"/>
+          <w:lang w:eastAsia="en-AE"/>
+          <w14:ligatures w14:val="none"/>
+        </w:rPr>
+      </w:pPr>
+      <w:r>
+        <w:rPr>
+          <w:rFonts w:ascii="Times New Roman" w:eastAsia="Times New Roman" w:hAnsi="Times New Roman" w:cs="Times New Roman"/>
+          <w:b/>
+          <w:bCs/>
+          <w:kern w:val="0"/>
+          <w:sz w:val="24"/>
+          <w:szCs w:val="24"/>
+          <w:lang w:eastAsia="en-AE"/>
+          <w14:ligatures w14:val="none"/>
+        </w:rPr>
+        <w:t>The continue Statement</w:t>
+      </w:r>
+    </w:p>
+    <w:p>
+      <w:pPr>
+        <w:pStyle w:val="ListParagraph"/>
+        <w:spacing w:before="100" w:beforeAutospacing="1" w:after="100" w:afterAutospacing="1" w:line="240" w:lineRule="auto"/>
+        <w:ind w:left="1080"/>
+        <w:rPr>
+          <w:rFonts w:ascii="Times New Roman" w:eastAsia="Times New Roman" w:hAnsi="Times New Roman" w:cs="Times New Roman"/>
+          <w:kern w:val="0"/>
+          <w:sz w:val="24"/>
+          <w:szCs w:val="24"/>
+          <w:lang w:eastAsia="en-AE"/>
+          <w14:ligatures w14:val="none"/>
+        </w:rPr>
+      </w:pPr>
+      <w:r>
+        <w:rPr>
+          <w:rFonts w:ascii="Times New Roman" w:eastAsia="Times New Roman" w:hAnsi="Times New Roman" w:cs="Times New Roman"/>
+          <w:kern w:val="0"/>
+          <w:sz w:val="24"/>
+          <w:szCs w:val="24"/>
+          <w:lang w:eastAsia="en-AE"/>
+          <w14:ligatures w14:val="none"/>
+        </w:rPr>
+        <w:t xml:space="preserve">The </w:t>
+      </w:r>
+      <w:r>
+        <w:rPr>
+          <w:rFonts w:ascii="Times New Roman" w:eastAsia="Times New Roman" w:hAnsi="Times New Roman" w:cs="Times New Roman"/>
+          <w:b/>
+          <w:bCs/>
+          <w:kern w:val="0"/>
+          <w:sz w:val="24"/>
+          <w:szCs w:val="24"/>
+          <w:lang w:eastAsia="en-AE"/>
+          <w14:ligatures w14:val="none"/>
+        </w:rPr>
+        <w:t>continue</w:t>
+      </w:r>
+      <w:r>
+        <w:rPr>
+          <w:rFonts w:ascii="Times New Roman" w:eastAsia="Times New Roman" w:hAnsi="Times New Roman" w:cs="Times New Roman"/>
+          <w:kern w:val="0"/>
+          <w:sz w:val="24"/>
+          <w:szCs w:val="24"/>
+          <w:lang w:eastAsia="en-AE"/>
+          <w14:ligatures w14:val="none"/>
+        </w:rPr>
+        <w:t xml:space="preserve"> statement skips the remaining statements in the current iteration and immediately starts the next iteration of the loop.</w:t>
+      </w:r>
+    </w:p>
+    <w:p>
+      <w:pPr>
+        <w:pStyle w:val="ListParagraph"/>
+        <w:spacing w:before="100" w:beforeAutospacing="1" w:after="100" w:afterAutospacing="1" w:line="240" w:lineRule="auto"/>
+        <w:ind w:left="1080"/>
+        <w:rPr>
+          <w:rFonts w:ascii="Times New Roman" w:eastAsia="Times New Roman" w:hAnsi="Times New Roman" w:cs="Times New Roman"/>
+          <w:kern w:val="0"/>
+          <w:sz w:val="24"/>
+          <w:szCs w:val="24"/>
+          <w:lang w:eastAsia="en-AE"/>
+          <w14:ligatures w14:val="none"/>
+        </w:rPr>
+      </w:pPr>
+    </w:p>
+    <w:p>
+      <w:pPr>
+        <w:pStyle w:val="ListParagraph"/>
+        <w:spacing w:before="100" w:beforeAutospacing="1" w:after="100" w:afterAutospacing="1" w:line="240" w:lineRule="auto"/>
+        <w:ind w:left="1080"/>
+        <w:rPr>
+          <w:rFonts w:ascii="Times New Roman" w:eastAsia="Times New Roman" w:hAnsi="Times New Roman" w:cs="Times New Roman"/>
+          <w:kern w:val="0"/>
+          <w:sz w:val="24"/>
+          <w:szCs w:val="24"/>
+          <w:lang w:eastAsia="en-AE"/>
+          <w14:ligatures w14:val="none"/>
+        </w:rPr>
+      </w:pPr>
+      <w:r>
+        <w:rPr>
+          <w:rFonts w:ascii="Times New Roman" w:eastAsia="Times New Roman" w:hAnsi="Times New Roman" w:cs="Times New Roman"/>
+          <w:kern w:val="0"/>
+          <w:sz w:val="24"/>
+          <w:szCs w:val="24"/>
+          <w:lang w:eastAsia="en-AE"/>
+          <w14:ligatures w14:val="none"/>
+        </w:rPr>
+        <w:t xml:space="preserve">think of </w:t>
+      </w:r>
+      <w:r>
+        <w:rPr>
+          <w:rFonts w:ascii="Times New Roman" w:eastAsia="Times New Roman" w:hAnsi="Times New Roman" w:cs="Times New Roman"/>
+          <w:b/>
+          <w:bCs/>
+          <w:kern w:val="0"/>
+          <w:sz w:val="24"/>
+          <w:szCs w:val="24"/>
+          <w:lang w:eastAsia="en-AE"/>
+          <w14:ligatures w14:val="none"/>
+        </w:rPr>
+        <w:t>switch</w:t>
+      </w:r>
+      <w:r>
+        <w:rPr>
+          <w:rFonts w:ascii="Times New Roman" w:eastAsia="Times New Roman" w:hAnsi="Times New Roman" w:cs="Times New Roman"/>
+          <w:kern w:val="0"/>
+          <w:sz w:val="24"/>
+          <w:szCs w:val="24"/>
+          <w:lang w:eastAsia="en-AE"/>
+          <w14:ligatures w14:val="none"/>
+        </w:rPr>
+        <w:t xml:space="preserve"> as a </w:t>
+      </w:r>
+      <w:r>
+        <w:rPr>
+          <w:rFonts w:ascii="Times New Roman" w:eastAsia="Times New Roman" w:hAnsi="Times New Roman" w:cs="Times New Roman"/>
+          <w:b/>
+          <w:bCs/>
+          <w:kern w:val="0"/>
+          <w:sz w:val="24"/>
+          <w:szCs w:val="24"/>
+          <w:lang w:eastAsia="en-AE"/>
+          <w14:ligatures w14:val="none"/>
+        </w:rPr>
+        <w:t>decision table</w:t>
+      </w:r>
+      <w:r>
+        <w:rPr>
+          <w:rFonts w:ascii="Times New Roman" w:eastAsia="Times New Roman" w:hAnsi="Times New Roman" w:cs="Times New Roman"/>
+          <w:kern w:val="0"/>
+          <w:sz w:val="24"/>
+          <w:szCs w:val="24"/>
+          <w:lang w:eastAsia="en-AE"/>
+          <w14:ligatures w14:val="none"/>
+        </w:rPr>
+        <w:t xml:space="preserve"> rather than a series of conditions. They use it when one variable determines multiple possible outcomes because it is clearer, easier to extend, and less error-prone than long if...else if chains. Modern Java developers generally prefer the </w:t>
+      </w:r>
+      <w:r>
+        <w:rPr>
+          <w:rFonts w:ascii="Times New Roman" w:eastAsia="Times New Roman" w:hAnsi="Times New Roman" w:cs="Times New Roman"/>
+          <w:b/>
+          <w:bCs/>
+          <w:kern w:val="0"/>
+          <w:sz w:val="24"/>
+          <w:szCs w:val="24"/>
+          <w:lang w:eastAsia="en-AE"/>
+          <w14:ligatures w14:val="none"/>
+        </w:rPr>
+        <w:t>arrow (-&gt;) syntax</w:t>
+      </w:r>
+      <w:r>
+        <w:rPr>
+          <w:rFonts w:ascii="Times New Roman" w:eastAsia="Times New Roman" w:hAnsi="Times New Roman" w:cs="Times New Roman"/>
+          <w:kern w:val="0"/>
+          <w:sz w:val="24"/>
+          <w:szCs w:val="24"/>
+          <w:lang w:eastAsia="en-AE"/>
+          <w14:ligatures w14:val="none"/>
+        </w:rPr>
+        <w:t xml:space="preserve"> and </w:t>
+      </w:r>
+      <w:r>
+        <w:rPr>
+          <w:rFonts w:ascii="Times New Roman" w:eastAsia="Times New Roman" w:hAnsi="Times New Roman" w:cs="Times New Roman"/>
+          <w:b/>
+          <w:bCs/>
+          <w:kern w:val="0"/>
+          <w:sz w:val="24"/>
+          <w:szCs w:val="24"/>
+          <w:lang w:eastAsia="en-AE"/>
+          <w14:ligatures w14:val="none"/>
+        </w:rPr>
+        <w:t>switch expressions</w:t>
+      </w:r>
+      <w:r>
+        <w:rPr>
+          <w:rFonts w:ascii="Times New Roman" w:eastAsia="Times New Roman" w:hAnsi="Times New Roman" w:cs="Times New Roman"/>
+          <w:kern w:val="0"/>
+          <w:sz w:val="24"/>
+          <w:szCs w:val="24"/>
+          <w:lang w:eastAsia="en-AE"/>
+          <w14:ligatures w14:val="none"/>
+        </w:rPr>
+        <w:t xml:space="preserve"> since they eliminate accidental fall-through and produce more predictable code. They also use </w:t>
+      </w:r>
+      <w:r>
+        <w:rPr>
+          <w:rFonts w:ascii="Times New Roman" w:eastAsia="Times New Roman" w:hAnsi="Times New Roman" w:cs="Times New Roman"/>
+          <w:b/>
+          <w:bCs/>
+          <w:kern w:val="0"/>
+          <w:sz w:val="24"/>
+          <w:szCs w:val="24"/>
+          <w:lang w:eastAsia="en-AE"/>
+          <w14:ligatures w14:val="none"/>
+        </w:rPr>
+        <w:t>break</w:t>
+      </w:r>
+      <w:r>
+        <w:rPr>
+          <w:rFonts w:ascii="Times New Roman" w:eastAsia="Times New Roman" w:hAnsi="Times New Roman" w:cs="Times New Roman"/>
+          <w:kern w:val="0"/>
+          <w:sz w:val="24"/>
+          <w:szCs w:val="24"/>
+          <w:lang w:eastAsia="en-AE"/>
+          <w14:ligatures w14:val="none"/>
+        </w:rPr>
+        <w:t xml:space="preserve"> and </w:t>
+      </w:r>
+      <w:r>
+        <w:rPr>
+          <w:rFonts w:ascii="Times New Roman" w:eastAsia="Times New Roman" w:hAnsi="Times New Roman" w:cs="Times New Roman"/>
+          <w:b/>
+          <w:bCs/>
+          <w:kern w:val="0"/>
+          <w:sz w:val="24"/>
+          <w:szCs w:val="24"/>
+          <w:lang w:eastAsia="en-AE"/>
+          <w14:ligatures w14:val="none"/>
+        </w:rPr>
+        <w:t>continue</w:t>
+      </w:r>
+      <w:r>
+        <w:rPr>
+          <w:rFonts w:ascii="Times New Roman" w:eastAsia="Times New Roman" w:hAnsi="Times New Roman" w:cs="Times New Roman"/>
+          <w:kern w:val="0"/>
+          <w:sz w:val="24"/>
+          <w:szCs w:val="24"/>
+          <w:lang w:eastAsia="en-AE"/>
+          <w14:ligatures w14:val="none"/>
+        </w:rPr>
+        <w:t xml:space="preserve"> sparingly</w:t>
+      </w:r>
+      <w:r>
+        <w:rPr>
+          <w:rFonts w:ascii="Times New Roman" w:eastAsia="Times New Roman" w:hAnsi="Times New Roman" w:cs="Times New Roman"/>
+          <w:kern w:val="0"/>
+          <w:sz w:val="24"/>
+          <w:szCs w:val="24"/>
+          <w:lang w:eastAsia="en-AE"/>
+          <w14:ligatures w14:val="none"/>
+        </w:rPr>
+        <w:t xml:space="preserve"> </w:t>
+      </w:r>
+      <w:r>
+        <w:rPr>
+          <w:rFonts w:ascii="Times New Roman" w:eastAsia="Times New Roman" w:hAnsi="Times New Roman" w:cs="Times New Roman"/>
+          <w:kern w:val="0"/>
+          <w:sz w:val="24"/>
+          <w:szCs w:val="24"/>
+          <w:lang w:eastAsia="en-AE"/>
+          <w14:ligatures w14:val="none"/>
+        </w:rPr>
+        <w:t>only when these statements simplify the logic</w:t>
+      </w:r>
+      <w:r>
+        <w:rPr>
+          <w:rFonts w:ascii="Times New Roman" w:eastAsia="Times New Roman" w:hAnsi="Times New Roman" w:cs="Times New Roman"/>
+          <w:kern w:val="0"/>
+          <w:sz w:val="24"/>
+          <w:szCs w:val="24"/>
+          <w:lang w:eastAsia="en-AE"/>
+          <w14:ligatures w14:val="none"/>
+        </w:rPr>
+        <w:t xml:space="preserve"> </w:t>
+      </w:r>
+      <w:r>
+        <w:rPr>
+          <w:rFonts w:ascii="Times New Roman" w:eastAsia="Times New Roman" w:hAnsi="Times New Roman" w:cs="Times New Roman"/>
+          <w:kern w:val="0"/>
+          <w:sz w:val="24"/>
+          <w:szCs w:val="24"/>
+          <w:lang w:eastAsia="en-AE"/>
+          <w14:ligatures w14:val="none"/>
+        </w:rPr>
+        <w:t>because excessive use can make the program's flow harder to follow. The goal is to keep control flow structured, readable, and easy to maintain.</w:t>
+      </w:r>
+    </w:p>
+    <w:p>
+      <w:pPr>
+        <w:spacing w:line="480" w:lineRule="auto"/>
+        <w:rPr>
+          <w:b/>
+          <w:bCs/>
+          <w:sz w:val="26"/>
+          <w:szCs w:val="26"/>
+        </w:rPr>
+      </w:pPr>
+    </w:p>
+    <w:p>
+      <w:pPr>
+        <w:pStyle w:val="ListParagraph"/>
+        <w:spacing w:line="480" w:lineRule="auto"/>
+        <w:ind w:left="426"/>
+        <w:rPr>
+          <w:b/>
+          <w:bCs/>
+          <w:sz w:val="26"/>
+          <w:szCs w:val="26"/>
+        </w:rPr>
+      </w:pPr>
+    </w:p>
+    <w:p>
+      <w:pPr>
+        <w:pStyle w:val="ListParagraph"/>
+        <w:ind w:left="1080"/>
+      </w:pPr>
+    </w:p>
+    <w:p/>
     <w:p/>
     <w:sectPr>
       <w:pgSz w:w="11906" w:h="16838"/>
@@ -3114,6 +6020,119 @@
 <file path=word/numbering.xml><?xml version="1.0" encoding="utf-8"?>
 <w:numbering xmlns:wpc="http://schemas.microsoft.com/office/word/2010/wordprocessingCanvas" xmlns:cx="http://schemas.microsoft.com/office/drawing/2014/chartex" xmlns:cx1="http://schemas.microsoft.com/office/drawing/2015/9/8/chartex" xmlns:cx2="http://schemas.microsoft.com/office/drawing/2015/10/21/chartex" xmlns:cx3="http://schemas.microsoft.com/office/drawing/2016/5/9/chartex" xmlns:cx4="http://schemas.microsoft.com/office/drawing/2016/5/10/chartex" xmlns:cx5="http://schemas.microsoft.com/office/drawing/2016/5/11/chartex" xmlns:cx6="http://schemas.microsoft.com/office/drawing/2016/5/12/chartex" xmlns:cx7="http://schemas.microsoft.com/office/drawing/2016/5/13/chartex" xmlns:cx8="http://schemas.microsoft.com/office/drawing/2016/5/14/chartex" xmlns:mc="http://schemas.openxmlformats.org/markup-compatibility/2006" xmlns:aink="http://schemas.microsoft.com/office/drawing/2016/ink" xmlns:am3d="http://schemas.microsoft.com/office/drawing/2017/model3d" xmlns:o="urn:schemas-microsoft-com:office:office" xmlns:oel="http://schemas.microsoft.com/office/2019/extlst" xmlns:r="http://schemas.openxmlformats.org/officeDocument/2006/relationships" xmlns:m="http://schemas.openxmlformats.org/officeDocument/2006/math" xmlns:v="urn:schemas-microsoft-com:vml" xmlns:wp14="http://schemas.microsoft.com/office/word/2010/wordprocessingDrawing" xmlns:wp="http://schemas.openxmlformats.org/drawingml/2006/wordprocessingDrawing" xmlns:w10="urn:schemas-microsoft-com:office:word" xmlns:w="http://schemas.openxmlformats.org/wordprocessingml/2006/main" xmlns:w14="http://schemas.microsoft.com/office/word/2010/wordml" xmlns:w15="http://schemas.microsoft.com/office/word/2012/wordml" xmlns:w16cex="http://schemas.microsoft.com/office/word/2018/wordml/cex" xmlns:w16cid="http://schemas.microsoft.com/office/word/2016/wordml/cid" xmlns:w16="http://schemas.microsoft.com/office/word/2018/wordml" xmlns:w16du="http://schemas.microsoft.com/office/word/2023/wordml/word16du" xmlns:w16sdtdh="http://schemas.microsoft.com/office/word/2020/wordml/sdtdatahash" xmlns:w16sdtfl="http://schemas.microsoft.com/office/word/2024/wordml/sdtformatlock" xmlns:w16se="http://schemas.microsoft.com/office/word/2015/wordml/symex" xmlns:wpg="http://schemas.microsoft.com/office/word/2010/wordprocessingGroup" xmlns:wpi="http://schemas.microsoft.com/office/word/2010/wordprocessingInk" xmlns:wne="http://schemas.microsoft.com/office/word/2006/wordml" xmlns:wps="http://schemas.microsoft.com/office/word/2010/wordprocessingShape" mc:Ignorable="w14 w15 w16se w16cid w16 w16cex w16sdtdh w16sdtfl w16du wp14">
   <w:abstractNum w:abstractNumId="0" w15:restartNumberingAfterBreak="0">
+    <w:nsid w:val="038379DD"/>
+    <w:multiLevelType w:val="hybridMultilevel"/>
+    <w:tmpl w:val="D0FE5392"/>
+    <w:lvl w:ilvl="0" w:tplc="4C090001">
+      <w:start w:val="1"/>
+      <w:numFmt w:val="bullet"/>
+      <w:lvlText w:val=""/>
+      <w:lvlJc w:val="left"/>
+      <w:pPr>
+        <w:ind w:left="720" w:hanging="360"/>
+      </w:pPr>
+      <w:rPr>
+        <w:rFonts w:ascii="Symbol" w:hAnsi="Symbol" w:hint="default"/>
+      </w:rPr>
+    </w:lvl>
+    <w:lvl w:ilvl="1" w:tplc="4C090003" w:tentative="1">
+      <w:start w:val="1"/>
+      <w:numFmt w:val="bullet"/>
+      <w:lvlText w:val="o"/>
+      <w:lvlJc w:val="left"/>
+      <w:pPr>
+        <w:ind w:left="1440" w:hanging="360"/>
+      </w:pPr>
+      <w:rPr>
+        <w:rFonts w:ascii="Courier New" w:hAnsi="Courier New" w:cs="Courier New" w:hint="default"/>
+      </w:rPr>
+    </w:lvl>
+    <w:lvl w:ilvl="2" w:tplc="4C090005" w:tentative="1">
+      <w:start w:val="1"/>
+      <w:numFmt w:val="bullet"/>
+      <w:lvlText w:val=""/>
+      <w:lvlJc w:val="left"/>
+      <w:pPr>
+        <w:ind w:left="2160" w:hanging="360"/>
+      </w:pPr>
+      <w:rPr>
+        <w:rFonts w:ascii="Wingdings" w:hAnsi="Wingdings" w:hint="default"/>
+      </w:rPr>
+    </w:lvl>
+    <w:lvl w:ilvl="3" w:tplc="4C090001" w:tentative="1">
+      <w:start w:val="1"/>
+      <w:numFmt w:val="bullet"/>
+      <w:lvlText w:val=""/>
+      <w:lvlJc w:val="left"/>
+      <w:pPr>
+        <w:ind w:left="2880" w:hanging="360"/>
+      </w:pPr>
+      <w:rPr>
+        <w:rFonts w:ascii="Symbol" w:hAnsi="Symbol" w:hint="default"/>
+      </w:rPr>
+    </w:lvl>
+    <w:lvl w:ilvl="4" w:tplc="4C090003" w:tentative="1">
+      <w:start w:val="1"/>
+      <w:numFmt w:val="bullet"/>
+      <w:lvlText w:val="o"/>
+      <w:lvlJc w:val="left"/>
+      <w:pPr>
+        <w:ind w:left="3600" w:hanging="360"/>
+      </w:pPr>
+      <w:rPr>
+        <w:rFonts w:ascii="Courier New" w:hAnsi="Courier New" w:cs="Courier New" w:hint="default"/>
+      </w:rPr>
+    </w:lvl>
+    <w:lvl w:ilvl="5" w:tplc="4C090005" w:tentative="1">
+      <w:start w:val="1"/>
+      <w:numFmt w:val="bullet"/>
+      <w:lvlText w:val=""/>
+      <w:lvlJc w:val="left"/>
+      <w:pPr>
+        <w:ind w:left="4320" w:hanging="360"/>
+      </w:pPr>
+      <w:rPr>
+        <w:rFonts w:ascii="Wingdings" w:hAnsi="Wingdings" w:hint="default"/>
+      </w:rPr>
+    </w:lvl>
+    <w:lvl w:ilvl="6" w:tplc="4C090001" w:tentative="1">
+      <w:start w:val="1"/>
+      <w:numFmt w:val="bullet"/>
+      <w:lvlText w:val=""/>
+      <w:lvlJc w:val="left"/>
+      <w:pPr>
+        <w:ind w:left="5040" w:hanging="360"/>
+      </w:pPr>
+      <w:rPr>
+        <w:rFonts w:ascii="Symbol" w:hAnsi="Symbol" w:hint="default"/>
+      </w:rPr>
+    </w:lvl>
+    <w:lvl w:ilvl="7" w:tplc="4C090003" w:tentative="1">
+      <w:start w:val="1"/>
+      <w:numFmt w:val="bullet"/>
+      <w:lvlText w:val="o"/>
+      <w:lvlJc w:val="left"/>
+      <w:pPr>
+        <w:ind w:left="5760" w:hanging="360"/>
+      </w:pPr>
+      <w:rPr>
+        <w:rFonts w:ascii="Courier New" w:hAnsi="Courier New" w:cs="Courier New" w:hint="default"/>
+      </w:rPr>
+    </w:lvl>
+    <w:lvl w:ilvl="8" w:tplc="4C090005" w:tentative="1">
+      <w:start w:val="1"/>
+      <w:numFmt w:val="bullet"/>
+      <w:lvlText w:val=""/>
+      <w:lvlJc w:val="left"/>
+      <w:pPr>
+        <w:ind w:left="6480" w:hanging="360"/>
+      </w:pPr>
+      <w:rPr>
+        <w:rFonts w:ascii="Wingdings" w:hAnsi="Wingdings" w:hint="default"/>
+      </w:rPr>
+    </w:lvl>
+  </w:abstractNum>
+  <w:abstractNum w:abstractNumId="1" w15:restartNumberingAfterBreak="0">
     <w:nsid w:val="108D284E"/>
     <w:multiLevelType w:val="hybridMultilevel"/>
     <w:tmpl w:val="037C0B2E"/>
@@ -3199,10 +6218,10 @@
       </w:pPr>
     </w:lvl>
   </w:abstractNum>
-  <w:abstractNum w:abstractNumId="1" w15:restartNumberingAfterBreak="0">
+  <w:abstractNum w:abstractNumId="2" w15:restartNumberingAfterBreak="0">
     <w:nsid w:val="1F9D7279"/>
     <w:multiLevelType w:val="hybridMultilevel"/>
-    <w:tmpl w:val="5E6A658C"/>
+    <w:tmpl w:val="77C64534"/>
     <w:lvl w:ilvl="0" w:tplc="4C090001">
       <w:start w:val="1"/>
       <w:numFmt w:val="bullet"/>
@@ -3312,7 +6331,233 @@
       </w:rPr>
     </w:lvl>
   </w:abstractNum>
-  <w:abstractNum w:abstractNumId="2" w15:restartNumberingAfterBreak="0">
+  <w:abstractNum w:abstractNumId="3" w15:restartNumberingAfterBreak="0">
+    <w:nsid w:val="230C3BBD"/>
+    <w:multiLevelType w:val="multilevel"/>
+    <w:tmpl w:val="18086AC8"/>
+    <w:lvl w:ilvl="0">
+      <w:start w:val="1"/>
+      <w:numFmt w:val="decimal"/>
+      <w:lvlText w:val="%1."/>
+      <w:lvlJc w:val="left"/>
+      <w:pPr>
+        <w:tabs>
+          <w:tab w:val="num" w:pos="720"/>
+        </w:tabs>
+        <w:ind w:left="720" w:hanging="360"/>
+      </w:pPr>
+    </w:lvl>
+    <w:lvl w:ilvl="1" w:tentative="1">
+      <w:start w:val="1"/>
+      <w:numFmt w:val="decimal"/>
+      <w:lvlText w:val="%2."/>
+      <w:lvlJc w:val="left"/>
+      <w:pPr>
+        <w:tabs>
+          <w:tab w:val="num" w:pos="1440"/>
+        </w:tabs>
+        <w:ind w:left="1440" w:hanging="360"/>
+      </w:pPr>
+    </w:lvl>
+    <w:lvl w:ilvl="2" w:tentative="1">
+      <w:start w:val="1"/>
+      <w:numFmt w:val="decimal"/>
+      <w:lvlText w:val="%3."/>
+      <w:lvlJc w:val="left"/>
+      <w:pPr>
+        <w:tabs>
+          <w:tab w:val="num" w:pos="2160"/>
+        </w:tabs>
+        <w:ind w:left="2160" w:hanging="360"/>
+      </w:pPr>
+    </w:lvl>
+    <w:lvl w:ilvl="3" w:tentative="1">
+      <w:start w:val="1"/>
+      <w:numFmt w:val="decimal"/>
+      <w:lvlText w:val="%4."/>
+      <w:lvlJc w:val="left"/>
+      <w:pPr>
+        <w:tabs>
+          <w:tab w:val="num" w:pos="2880"/>
+        </w:tabs>
+        <w:ind w:left="2880" w:hanging="360"/>
+      </w:pPr>
+    </w:lvl>
+    <w:lvl w:ilvl="4" w:tentative="1">
+      <w:start w:val="1"/>
+      <w:numFmt w:val="decimal"/>
+      <w:lvlText w:val="%5."/>
+      <w:lvlJc w:val="left"/>
+      <w:pPr>
+        <w:tabs>
+          <w:tab w:val="num" w:pos="3600"/>
+        </w:tabs>
+        <w:ind w:left="3600" w:hanging="360"/>
+      </w:pPr>
+    </w:lvl>
+    <w:lvl w:ilvl="5" w:tentative="1">
+      <w:start w:val="1"/>
+      <w:numFmt w:val="decimal"/>
+      <w:lvlText w:val="%6."/>
+      <w:lvlJc w:val="left"/>
+      <w:pPr>
+        <w:tabs>
+          <w:tab w:val="num" w:pos="4320"/>
+        </w:tabs>
+        <w:ind w:left="4320" w:hanging="360"/>
+      </w:pPr>
+    </w:lvl>
+    <w:lvl w:ilvl="6" w:tentative="1">
+      <w:start w:val="1"/>
+      <w:numFmt w:val="decimal"/>
+      <w:lvlText w:val="%7."/>
+      <w:lvlJc w:val="left"/>
+      <w:pPr>
+        <w:tabs>
+          <w:tab w:val="num" w:pos="5040"/>
+        </w:tabs>
+        <w:ind w:left="5040" w:hanging="360"/>
+      </w:pPr>
+    </w:lvl>
+    <w:lvl w:ilvl="7" w:tentative="1">
+      <w:start w:val="1"/>
+      <w:numFmt w:val="decimal"/>
+      <w:lvlText w:val="%8."/>
+      <w:lvlJc w:val="left"/>
+      <w:pPr>
+        <w:tabs>
+          <w:tab w:val="num" w:pos="5760"/>
+        </w:tabs>
+        <w:ind w:left="5760" w:hanging="360"/>
+      </w:pPr>
+    </w:lvl>
+    <w:lvl w:ilvl="8" w:tentative="1">
+      <w:start w:val="1"/>
+      <w:numFmt w:val="decimal"/>
+      <w:lvlText w:val="%9."/>
+      <w:lvlJc w:val="left"/>
+      <w:pPr>
+        <w:tabs>
+          <w:tab w:val="num" w:pos="6480"/>
+        </w:tabs>
+        <w:ind w:left="6480" w:hanging="360"/>
+      </w:pPr>
+    </w:lvl>
+  </w:abstractNum>
+  <w:abstractNum w:abstractNumId="4" w15:restartNumberingAfterBreak="0">
+    <w:nsid w:val="2F981CA2"/>
+    <w:multiLevelType w:val="multilevel"/>
+    <w:tmpl w:val="62F60640"/>
+    <w:lvl w:ilvl="0">
+      <w:start w:val="1"/>
+      <w:numFmt w:val="decimal"/>
+      <w:lvlText w:val="%1."/>
+      <w:lvlJc w:val="left"/>
+      <w:pPr>
+        <w:tabs>
+          <w:tab w:val="num" w:pos="720"/>
+        </w:tabs>
+        <w:ind w:left="720" w:hanging="360"/>
+      </w:pPr>
+    </w:lvl>
+    <w:lvl w:ilvl="1" w:tentative="1">
+      <w:start w:val="1"/>
+      <w:numFmt w:val="decimal"/>
+      <w:lvlText w:val="%2."/>
+      <w:lvlJc w:val="left"/>
+      <w:pPr>
+        <w:tabs>
+          <w:tab w:val="num" w:pos="1440"/>
+        </w:tabs>
+        <w:ind w:left="1440" w:hanging="360"/>
+      </w:pPr>
+    </w:lvl>
+    <w:lvl w:ilvl="2" w:tentative="1">
+      <w:start w:val="1"/>
+      <w:numFmt w:val="decimal"/>
+      <w:lvlText w:val="%3."/>
+      <w:lvlJc w:val="left"/>
+      <w:pPr>
+        <w:tabs>
+          <w:tab w:val="num" w:pos="2160"/>
+        </w:tabs>
+        <w:ind w:left="2160" w:hanging="360"/>
+      </w:pPr>
+    </w:lvl>
+    <w:lvl w:ilvl="3" w:tentative="1">
+      <w:start w:val="1"/>
+      <w:numFmt w:val="decimal"/>
+      <w:lvlText w:val="%4."/>
+      <w:lvlJc w:val="left"/>
+      <w:pPr>
+        <w:tabs>
+          <w:tab w:val="num" w:pos="2880"/>
+        </w:tabs>
+        <w:ind w:left="2880" w:hanging="360"/>
+      </w:pPr>
+    </w:lvl>
+    <w:lvl w:ilvl="4" w:tentative="1">
+      <w:start w:val="1"/>
+      <w:numFmt w:val="decimal"/>
+      <w:lvlText w:val="%5."/>
+      <w:lvlJc w:val="left"/>
+      <w:pPr>
+        <w:tabs>
+          <w:tab w:val="num" w:pos="3600"/>
+        </w:tabs>
+        <w:ind w:left="3600" w:hanging="360"/>
+      </w:pPr>
+    </w:lvl>
+    <w:lvl w:ilvl="5" w:tentative="1">
+      <w:start w:val="1"/>
+      <w:numFmt w:val="decimal"/>
+      <w:lvlText w:val="%6."/>
+      <w:lvlJc w:val="left"/>
+      <w:pPr>
+        <w:tabs>
+          <w:tab w:val="num" w:pos="4320"/>
+        </w:tabs>
+        <w:ind w:left="4320" w:hanging="360"/>
+      </w:pPr>
+    </w:lvl>
+    <w:lvl w:ilvl="6" w:tentative="1">
+      <w:start w:val="1"/>
+      <w:numFmt w:val="decimal"/>
+      <w:lvlText w:val="%7."/>
+      <w:lvlJc w:val="left"/>
+      <w:pPr>
+        <w:tabs>
+          <w:tab w:val="num" w:pos="5040"/>
+        </w:tabs>
+        <w:ind w:left="5040" w:hanging="360"/>
+      </w:pPr>
+    </w:lvl>
+    <w:lvl w:ilvl="7" w:tentative="1">
+      <w:start w:val="1"/>
+      <w:numFmt w:val="decimal"/>
+      <w:lvlText w:val="%8."/>
+      <w:lvlJc w:val="left"/>
+      <w:pPr>
+        <w:tabs>
+          <w:tab w:val="num" w:pos="5760"/>
+        </w:tabs>
+        <w:ind w:left="5760" w:hanging="360"/>
+      </w:pPr>
+    </w:lvl>
+    <w:lvl w:ilvl="8" w:tentative="1">
+      <w:start w:val="1"/>
+      <w:numFmt w:val="decimal"/>
+      <w:lvlText w:val="%9."/>
+      <w:lvlJc w:val="left"/>
+      <w:pPr>
+        <w:tabs>
+          <w:tab w:val="num" w:pos="6480"/>
+        </w:tabs>
+        <w:ind w:left="6480" w:hanging="360"/>
+      </w:pPr>
+    </w:lvl>
+  </w:abstractNum>
+  <w:abstractNum w:abstractNumId="5" w15:restartNumberingAfterBreak="0">
     <w:nsid w:val="33A61209"/>
     <w:multiLevelType w:val="hybridMultilevel"/>
     <w:tmpl w:val="037C0B2E"/>
@@ -3398,7 +6643,93 @@
       </w:pPr>
     </w:lvl>
   </w:abstractNum>
-  <w:abstractNum w:abstractNumId="3" w15:restartNumberingAfterBreak="0">
+  <w:abstractNum w:abstractNumId="6" w15:restartNumberingAfterBreak="0">
+    <w:nsid w:val="37881DD6"/>
+    <w:multiLevelType w:val="hybridMultilevel"/>
+    <w:tmpl w:val="037C0B2E"/>
+    <w:lvl w:ilvl="0" w:tplc="FFFFFFFF">
+      <w:start w:val="1"/>
+      <w:numFmt w:val="decimal"/>
+      <w:lvlText w:val="%1."/>
+      <w:lvlJc w:val="left"/>
+      <w:pPr>
+        <w:ind w:left="720" w:hanging="360"/>
+      </w:pPr>
+    </w:lvl>
+    <w:lvl w:ilvl="1" w:tplc="FFFFFFFF" w:tentative="1">
+      <w:start w:val="1"/>
+      <w:numFmt w:val="lowerLetter"/>
+      <w:lvlText w:val="%2."/>
+      <w:lvlJc w:val="left"/>
+      <w:pPr>
+        <w:ind w:left="1440" w:hanging="360"/>
+      </w:pPr>
+    </w:lvl>
+    <w:lvl w:ilvl="2" w:tplc="FFFFFFFF" w:tentative="1">
+      <w:start w:val="1"/>
+      <w:numFmt w:val="lowerRoman"/>
+      <w:lvlText w:val="%3."/>
+      <w:lvlJc w:val="right"/>
+      <w:pPr>
+        <w:ind w:left="2160" w:hanging="180"/>
+      </w:pPr>
+    </w:lvl>
+    <w:lvl w:ilvl="3" w:tplc="FFFFFFFF" w:tentative="1">
+      <w:start w:val="1"/>
+      <w:numFmt w:val="decimal"/>
+      <w:lvlText w:val="%4."/>
+      <w:lvlJc w:val="left"/>
+      <w:pPr>
+        <w:ind w:left="2880" w:hanging="360"/>
+      </w:pPr>
+    </w:lvl>
+    <w:lvl w:ilvl="4" w:tplc="FFFFFFFF" w:tentative="1">
+      <w:start w:val="1"/>
+      <w:numFmt w:val="lowerLetter"/>
+      <w:lvlText w:val="%5."/>
+      <w:lvlJc w:val="left"/>
+      <w:pPr>
+        <w:ind w:left="3600" w:hanging="360"/>
+      </w:pPr>
+    </w:lvl>
+    <w:lvl w:ilvl="5" w:tplc="FFFFFFFF" w:tentative="1">
+      <w:start w:val="1"/>
+      <w:numFmt w:val="lowerRoman"/>
+      <w:lvlText w:val="%6."/>
+      <w:lvlJc w:val="right"/>
+      <w:pPr>
+        <w:ind w:left="4320" w:hanging="180"/>
+      </w:pPr>
+    </w:lvl>
+    <w:lvl w:ilvl="6" w:tplc="FFFFFFFF" w:tentative="1">
+      <w:start w:val="1"/>
+      <w:numFmt w:val="decimal"/>
+      <w:lvlText w:val="%7."/>
+      <w:lvlJc w:val="left"/>
+      <w:pPr>
+        <w:ind w:left="5040" w:hanging="360"/>
+      </w:pPr>
+    </w:lvl>
+    <w:lvl w:ilvl="7" w:tplc="FFFFFFFF" w:tentative="1">
+      <w:start w:val="1"/>
+      <w:numFmt w:val="lowerLetter"/>
+      <w:lvlText w:val="%8."/>
+      <w:lvlJc w:val="left"/>
+      <w:pPr>
+        <w:ind w:left="5760" w:hanging="360"/>
+      </w:pPr>
+    </w:lvl>
+    <w:lvl w:ilvl="8" w:tplc="FFFFFFFF" w:tentative="1">
+      <w:start w:val="1"/>
+      <w:numFmt w:val="lowerRoman"/>
+      <w:lvlText w:val="%9."/>
+      <w:lvlJc w:val="right"/>
+      <w:pPr>
+        <w:ind w:left="6480" w:hanging="180"/>
+      </w:pPr>
+    </w:lvl>
+  </w:abstractNum>
+  <w:abstractNum w:abstractNumId="7" w15:restartNumberingAfterBreak="0">
     <w:nsid w:val="38E91364"/>
     <w:multiLevelType w:val="multilevel"/>
     <w:tmpl w:val="37260A9E"/>
@@ -3547,7 +6878,793 @@
       </w:rPr>
     </w:lvl>
   </w:abstractNum>
-  <w:abstractNum w:abstractNumId="4" w15:restartNumberingAfterBreak="0">
+  <w:abstractNum w:abstractNumId="8" w15:restartNumberingAfterBreak="0">
+    <w:nsid w:val="43525FC5"/>
+    <w:multiLevelType w:val="multilevel"/>
+    <w:tmpl w:val="B7FA6ACA"/>
+    <w:lvl w:ilvl="0">
+      <w:start w:val="1"/>
+      <w:numFmt w:val="decimal"/>
+      <w:lvlText w:val="%1."/>
+      <w:lvlJc w:val="left"/>
+      <w:pPr>
+        <w:tabs>
+          <w:tab w:val="num" w:pos="720"/>
+        </w:tabs>
+        <w:ind w:left="720" w:hanging="360"/>
+      </w:pPr>
+    </w:lvl>
+    <w:lvl w:ilvl="1" w:tentative="1">
+      <w:start w:val="1"/>
+      <w:numFmt w:val="decimal"/>
+      <w:lvlText w:val="%2."/>
+      <w:lvlJc w:val="left"/>
+      <w:pPr>
+        <w:tabs>
+          <w:tab w:val="num" w:pos="1440"/>
+        </w:tabs>
+        <w:ind w:left="1440" w:hanging="360"/>
+      </w:pPr>
+    </w:lvl>
+    <w:lvl w:ilvl="2" w:tentative="1">
+      <w:start w:val="1"/>
+      <w:numFmt w:val="decimal"/>
+      <w:lvlText w:val="%3."/>
+      <w:lvlJc w:val="left"/>
+      <w:pPr>
+        <w:tabs>
+          <w:tab w:val="num" w:pos="2160"/>
+        </w:tabs>
+        <w:ind w:left="2160" w:hanging="360"/>
+      </w:pPr>
+    </w:lvl>
+    <w:lvl w:ilvl="3" w:tentative="1">
+      <w:start w:val="1"/>
+      <w:numFmt w:val="decimal"/>
+      <w:lvlText w:val="%4."/>
+      <w:lvlJc w:val="left"/>
+      <w:pPr>
+        <w:tabs>
+          <w:tab w:val="num" w:pos="2880"/>
+        </w:tabs>
+        <w:ind w:left="2880" w:hanging="360"/>
+      </w:pPr>
+    </w:lvl>
+    <w:lvl w:ilvl="4" w:tentative="1">
+      <w:start w:val="1"/>
+      <w:numFmt w:val="decimal"/>
+      <w:lvlText w:val="%5."/>
+      <w:lvlJc w:val="left"/>
+      <w:pPr>
+        <w:tabs>
+          <w:tab w:val="num" w:pos="3600"/>
+        </w:tabs>
+        <w:ind w:left="3600" w:hanging="360"/>
+      </w:pPr>
+    </w:lvl>
+    <w:lvl w:ilvl="5" w:tentative="1">
+      <w:start w:val="1"/>
+      <w:numFmt w:val="decimal"/>
+      <w:lvlText w:val="%6."/>
+      <w:lvlJc w:val="left"/>
+      <w:pPr>
+        <w:tabs>
+          <w:tab w:val="num" w:pos="4320"/>
+        </w:tabs>
+        <w:ind w:left="4320" w:hanging="360"/>
+      </w:pPr>
+    </w:lvl>
+    <w:lvl w:ilvl="6" w:tentative="1">
+      <w:start w:val="1"/>
+      <w:numFmt w:val="decimal"/>
+      <w:lvlText w:val="%7."/>
+      <w:lvlJc w:val="left"/>
+      <w:pPr>
+        <w:tabs>
+          <w:tab w:val="num" w:pos="5040"/>
+        </w:tabs>
+        <w:ind w:left="5040" w:hanging="360"/>
+      </w:pPr>
+    </w:lvl>
+    <w:lvl w:ilvl="7" w:tentative="1">
+      <w:start w:val="1"/>
+      <w:numFmt w:val="decimal"/>
+      <w:lvlText w:val="%8."/>
+      <w:lvlJc w:val="left"/>
+      <w:pPr>
+        <w:tabs>
+          <w:tab w:val="num" w:pos="5760"/>
+        </w:tabs>
+        <w:ind w:left="5760" w:hanging="360"/>
+      </w:pPr>
+    </w:lvl>
+    <w:lvl w:ilvl="8" w:tentative="1">
+      <w:start w:val="1"/>
+      <w:numFmt w:val="decimal"/>
+      <w:lvlText w:val="%9."/>
+      <w:lvlJc w:val="left"/>
+      <w:pPr>
+        <w:tabs>
+          <w:tab w:val="num" w:pos="6480"/>
+        </w:tabs>
+        <w:ind w:left="6480" w:hanging="360"/>
+      </w:pPr>
+    </w:lvl>
+  </w:abstractNum>
+  <w:abstractNum w:abstractNumId="9" w15:restartNumberingAfterBreak="0">
+    <w:nsid w:val="472A6889"/>
+    <w:multiLevelType w:val="multilevel"/>
+    <w:tmpl w:val="37589DEA"/>
+    <w:lvl w:ilvl="0">
+      <w:start w:val="1"/>
+      <w:numFmt w:val="bullet"/>
+      <w:lvlText w:val=""/>
+      <w:lvlJc w:val="left"/>
+      <w:pPr>
+        <w:tabs>
+          <w:tab w:val="num" w:pos="720"/>
+        </w:tabs>
+        <w:ind w:left="720" w:hanging="360"/>
+      </w:pPr>
+      <w:rPr>
+        <w:rFonts w:ascii="Symbol" w:hAnsi="Symbol" w:hint="default"/>
+        <w:sz w:val="20"/>
+      </w:rPr>
+    </w:lvl>
+    <w:lvl w:ilvl="1" w:tentative="1">
+      <w:start w:val="1"/>
+      <w:numFmt w:val="bullet"/>
+      <w:lvlText w:val="o"/>
+      <w:lvlJc w:val="left"/>
+      <w:pPr>
+        <w:tabs>
+          <w:tab w:val="num" w:pos="1440"/>
+        </w:tabs>
+        <w:ind w:left="1440" w:hanging="360"/>
+      </w:pPr>
+      <w:rPr>
+        <w:rFonts w:ascii="Courier New" w:hAnsi="Courier New" w:hint="default"/>
+        <w:sz w:val="20"/>
+      </w:rPr>
+    </w:lvl>
+    <w:lvl w:ilvl="2" w:tentative="1">
+      <w:start w:val="1"/>
+      <w:numFmt w:val="bullet"/>
+      <w:lvlText w:val=""/>
+      <w:lvlJc w:val="left"/>
+      <w:pPr>
+        <w:tabs>
+          <w:tab w:val="num" w:pos="2160"/>
+        </w:tabs>
+        <w:ind w:left="2160" w:hanging="360"/>
+      </w:pPr>
+      <w:rPr>
+        <w:rFonts w:ascii="Wingdings" w:hAnsi="Wingdings" w:hint="default"/>
+        <w:sz w:val="20"/>
+      </w:rPr>
+    </w:lvl>
+    <w:lvl w:ilvl="3" w:tentative="1">
+      <w:start w:val="1"/>
+      <w:numFmt w:val="bullet"/>
+      <w:lvlText w:val=""/>
+      <w:lvlJc w:val="left"/>
+      <w:pPr>
+        <w:tabs>
+          <w:tab w:val="num" w:pos="2880"/>
+        </w:tabs>
+        <w:ind w:left="2880" w:hanging="360"/>
+      </w:pPr>
+      <w:rPr>
+        <w:rFonts w:ascii="Wingdings" w:hAnsi="Wingdings" w:hint="default"/>
+        <w:sz w:val="20"/>
+      </w:rPr>
+    </w:lvl>
+    <w:lvl w:ilvl="4" w:tentative="1">
+      <w:start w:val="1"/>
+      <w:numFmt w:val="bullet"/>
+      <w:lvlText w:val=""/>
+      <w:lvlJc w:val="left"/>
+      <w:pPr>
+        <w:tabs>
+          <w:tab w:val="num" w:pos="3600"/>
+        </w:tabs>
+        <w:ind w:left="3600" w:hanging="360"/>
+      </w:pPr>
+      <w:rPr>
+        <w:rFonts w:ascii="Wingdings" w:hAnsi="Wingdings" w:hint="default"/>
+        <w:sz w:val="20"/>
+      </w:rPr>
+    </w:lvl>
+    <w:lvl w:ilvl="5" w:tentative="1">
+      <w:start w:val="1"/>
+      <w:numFmt w:val="bullet"/>
+      <w:lvlText w:val=""/>
+      <w:lvlJc w:val="left"/>
+      <w:pPr>
+        <w:tabs>
+          <w:tab w:val="num" w:pos="4320"/>
+        </w:tabs>
+        <w:ind w:left="4320" w:hanging="360"/>
+      </w:pPr>
+      <w:rPr>
+        <w:rFonts w:ascii="Wingdings" w:hAnsi="Wingdings" w:hint="default"/>
+        <w:sz w:val="20"/>
+      </w:rPr>
+    </w:lvl>
+    <w:lvl w:ilvl="6" w:tentative="1">
+      <w:start w:val="1"/>
+      <w:numFmt w:val="bullet"/>
+      <w:lvlText w:val=""/>
+      <w:lvlJc w:val="left"/>
+      <w:pPr>
+        <w:tabs>
+          <w:tab w:val="num" w:pos="5040"/>
+        </w:tabs>
+        <w:ind w:left="5040" w:hanging="360"/>
+      </w:pPr>
+      <w:rPr>
+        <w:rFonts w:ascii="Wingdings" w:hAnsi="Wingdings" w:hint="default"/>
+        <w:sz w:val="20"/>
+      </w:rPr>
+    </w:lvl>
+    <w:lvl w:ilvl="7" w:tentative="1">
+      <w:start w:val="1"/>
+      <w:numFmt w:val="bullet"/>
+      <w:lvlText w:val=""/>
+      <w:lvlJc w:val="left"/>
+      <w:pPr>
+        <w:tabs>
+          <w:tab w:val="num" w:pos="5760"/>
+        </w:tabs>
+        <w:ind w:left="5760" w:hanging="360"/>
+      </w:pPr>
+      <w:rPr>
+        <w:rFonts w:ascii="Wingdings" w:hAnsi="Wingdings" w:hint="default"/>
+        <w:sz w:val="20"/>
+      </w:rPr>
+    </w:lvl>
+    <w:lvl w:ilvl="8" w:tentative="1">
+      <w:start w:val="1"/>
+      <w:numFmt w:val="bullet"/>
+      <w:lvlText w:val=""/>
+      <w:lvlJc w:val="left"/>
+      <w:pPr>
+        <w:tabs>
+          <w:tab w:val="num" w:pos="6480"/>
+        </w:tabs>
+        <w:ind w:left="6480" w:hanging="360"/>
+      </w:pPr>
+      <w:rPr>
+        <w:rFonts w:ascii="Wingdings" w:hAnsi="Wingdings" w:hint="default"/>
+        <w:sz w:val="20"/>
+      </w:rPr>
+    </w:lvl>
+  </w:abstractNum>
+  <w:abstractNum w:abstractNumId="10" w15:restartNumberingAfterBreak="0">
+    <w:nsid w:val="4AFE321B"/>
+    <w:multiLevelType w:val="hybridMultilevel"/>
+    <w:tmpl w:val="F42A9B36"/>
+    <w:lvl w:ilvl="0" w:tplc="4C090001">
+      <w:start w:val="1"/>
+      <w:numFmt w:val="bullet"/>
+      <w:lvlText w:val=""/>
+      <w:lvlJc w:val="left"/>
+      <w:pPr>
+        <w:ind w:left="720" w:hanging="360"/>
+      </w:pPr>
+      <w:rPr>
+        <w:rFonts w:ascii="Symbol" w:hAnsi="Symbol" w:hint="default"/>
+      </w:rPr>
+    </w:lvl>
+    <w:lvl w:ilvl="1" w:tplc="4C090003" w:tentative="1">
+      <w:start w:val="1"/>
+      <w:numFmt w:val="bullet"/>
+      <w:lvlText w:val="o"/>
+      <w:lvlJc w:val="left"/>
+      <w:pPr>
+        <w:ind w:left="1440" w:hanging="360"/>
+      </w:pPr>
+      <w:rPr>
+        <w:rFonts w:ascii="Courier New" w:hAnsi="Courier New" w:cs="Courier New" w:hint="default"/>
+      </w:rPr>
+    </w:lvl>
+    <w:lvl w:ilvl="2" w:tplc="4C090005" w:tentative="1">
+      <w:start w:val="1"/>
+      <w:numFmt w:val="bullet"/>
+      <w:lvlText w:val=""/>
+      <w:lvlJc w:val="left"/>
+      <w:pPr>
+        <w:ind w:left="2160" w:hanging="360"/>
+      </w:pPr>
+      <w:rPr>
+        <w:rFonts w:ascii="Wingdings" w:hAnsi="Wingdings" w:hint="default"/>
+      </w:rPr>
+    </w:lvl>
+    <w:lvl w:ilvl="3" w:tplc="4C090001" w:tentative="1">
+      <w:start w:val="1"/>
+      <w:numFmt w:val="bullet"/>
+      <w:lvlText w:val=""/>
+      <w:lvlJc w:val="left"/>
+      <w:pPr>
+        <w:ind w:left="2880" w:hanging="360"/>
+      </w:pPr>
+      <w:rPr>
+        <w:rFonts w:ascii="Symbol" w:hAnsi="Symbol" w:hint="default"/>
+      </w:rPr>
+    </w:lvl>
+    <w:lvl w:ilvl="4" w:tplc="4C090003" w:tentative="1">
+      <w:start w:val="1"/>
+      <w:numFmt w:val="bullet"/>
+      <w:lvlText w:val="o"/>
+      <w:lvlJc w:val="left"/>
+      <w:pPr>
+        <w:ind w:left="3600" w:hanging="360"/>
+      </w:pPr>
+      <w:rPr>
+        <w:rFonts w:ascii="Courier New" w:hAnsi="Courier New" w:cs="Courier New" w:hint="default"/>
+      </w:rPr>
+    </w:lvl>
+    <w:lvl w:ilvl="5" w:tplc="4C090005" w:tentative="1">
+      <w:start w:val="1"/>
+      <w:numFmt w:val="bullet"/>
+      <w:lvlText w:val=""/>
+      <w:lvlJc w:val="left"/>
+      <w:pPr>
+        <w:ind w:left="4320" w:hanging="360"/>
+      </w:pPr>
+      <w:rPr>
+        <w:rFonts w:ascii="Wingdings" w:hAnsi="Wingdings" w:hint="default"/>
+      </w:rPr>
+    </w:lvl>
+    <w:lvl w:ilvl="6" w:tplc="4C090001" w:tentative="1">
+      <w:start w:val="1"/>
+      <w:numFmt w:val="bullet"/>
+      <w:lvlText w:val=""/>
+      <w:lvlJc w:val="left"/>
+      <w:pPr>
+        <w:ind w:left="5040" w:hanging="360"/>
+      </w:pPr>
+      <w:rPr>
+        <w:rFonts w:ascii="Symbol" w:hAnsi="Symbol" w:hint="default"/>
+      </w:rPr>
+    </w:lvl>
+    <w:lvl w:ilvl="7" w:tplc="4C090003" w:tentative="1">
+      <w:start w:val="1"/>
+      <w:numFmt w:val="bullet"/>
+      <w:lvlText w:val="o"/>
+      <w:lvlJc w:val="left"/>
+      <w:pPr>
+        <w:ind w:left="5760" w:hanging="360"/>
+      </w:pPr>
+      <w:rPr>
+        <w:rFonts w:ascii="Courier New" w:hAnsi="Courier New" w:cs="Courier New" w:hint="default"/>
+      </w:rPr>
+    </w:lvl>
+    <w:lvl w:ilvl="8" w:tplc="4C090005" w:tentative="1">
+      <w:start w:val="1"/>
+      <w:numFmt w:val="bullet"/>
+      <w:lvlText w:val=""/>
+      <w:lvlJc w:val="left"/>
+      <w:pPr>
+        <w:ind w:left="6480" w:hanging="360"/>
+      </w:pPr>
+      <w:rPr>
+        <w:rFonts w:ascii="Wingdings" w:hAnsi="Wingdings" w:hint="default"/>
+      </w:rPr>
+    </w:lvl>
+  </w:abstractNum>
+  <w:abstractNum w:abstractNumId="11" w15:restartNumberingAfterBreak="0">
+    <w:nsid w:val="4F3D114A"/>
+    <w:multiLevelType w:val="hybridMultilevel"/>
+    <w:tmpl w:val="F9AAA16E"/>
+    <w:lvl w:ilvl="0" w:tplc="4C090001">
+      <w:start w:val="1"/>
+      <w:numFmt w:val="bullet"/>
+      <w:lvlText w:val=""/>
+      <w:lvlJc w:val="left"/>
+      <w:pPr>
+        <w:ind w:left="1440" w:hanging="360"/>
+      </w:pPr>
+      <w:rPr>
+        <w:rFonts w:ascii="Symbol" w:hAnsi="Symbol" w:hint="default"/>
+      </w:rPr>
+    </w:lvl>
+    <w:lvl w:ilvl="1" w:tplc="4C090003" w:tentative="1">
+      <w:start w:val="1"/>
+      <w:numFmt w:val="bullet"/>
+      <w:lvlText w:val="o"/>
+      <w:lvlJc w:val="left"/>
+      <w:pPr>
+        <w:ind w:left="2160" w:hanging="360"/>
+      </w:pPr>
+      <w:rPr>
+        <w:rFonts w:ascii="Courier New" w:hAnsi="Courier New" w:cs="Courier New" w:hint="default"/>
+      </w:rPr>
+    </w:lvl>
+    <w:lvl w:ilvl="2" w:tplc="4C090005" w:tentative="1">
+      <w:start w:val="1"/>
+      <w:numFmt w:val="bullet"/>
+      <w:lvlText w:val=""/>
+      <w:lvlJc w:val="left"/>
+      <w:pPr>
+        <w:ind w:left="2880" w:hanging="360"/>
+      </w:pPr>
+      <w:rPr>
+        <w:rFonts w:ascii="Wingdings" w:hAnsi="Wingdings" w:hint="default"/>
+      </w:rPr>
+    </w:lvl>
+    <w:lvl w:ilvl="3" w:tplc="4C090001" w:tentative="1">
+      <w:start w:val="1"/>
+      <w:numFmt w:val="bullet"/>
+      <w:lvlText w:val=""/>
+      <w:lvlJc w:val="left"/>
+      <w:pPr>
+        <w:ind w:left="3600" w:hanging="360"/>
+      </w:pPr>
+      <w:rPr>
+        <w:rFonts w:ascii="Symbol" w:hAnsi="Symbol" w:hint="default"/>
+      </w:rPr>
+    </w:lvl>
+    <w:lvl w:ilvl="4" w:tplc="4C090003" w:tentative="1">
+      <w:start w:val="1"/>
+      <w:numFmt w:val="bullet"/>
+      <w:lvlText w:val="o"/>
+      <w:lvlJc w:val="left"/>
+      <w:pPr>
+        <w:ind w:left="4320" w:hanging="360"/>
+      </w:pPr>
+      <w:rPr>
+        <w:rFonts w:ascii="Courier New" w:hAnsi="Courier New" w:cs="Courier New" w:hint="default"/>
+      </w:rPr>
+    </w:lvl>
+    <w:lvl w:ilvl="5" w:tplc="4C090005" w:tentative="1">
+      <w:start w:val="1"/>
+      <w:numFmt w:val="bullet"/>
+      <w:lvlText w:val=""/>
+      <w:lvlJc w:val="left"/>
+      <w:pPr>
+        <w:ind w:left="5040" w:hanging="360"/>
+      </w:pPr>
+      <w:rPr>
+        <w:rFonts w:ascii="Wingdings" w:hAnsi="Wingdings" w:hint="default"/>
+      </w:rPr>
+    </w:lvl>
+    <w:lvl w:ilvl="6" w:tplc="4C090001" w:tentative="1">
+      <w:start w:val="1"/>
+      <w:numFmt w:val="bullet"/>
+      <w:lvlText w:val=""/>
+      <w:lvlJc w:val="left"/>
+      <w:pPr>
+        <w:ind w:left="5760" w:hanging="360"/>
+      </w:pPr>
+      <w:rPr>
+        <w:rFonts w:ascii="Symbol" w:hAnsi="Symbol" w:hint="default"/>
+      </w:rPr>
+    </w:lvl>
+    <w:lvl w:ilvl="7" w:tplc="4C090003" w:tentative="1">
+      <w:start w:val="1"/>
+      <w:numFmt w:val="bullet"/>
+      <w:lvlText w:val="o"/>
+      <w:lvlJc w:val="left"/>
+      <w:pPr>
+        <w:ind w:left="6480" w:hanging="360"/>
+      </w:pPr>
+      <w:rPr>
+        <w:rFonts w:ascii="Courier New" w:hAnsi="Courier New" w:cs="Courier New" w:hint="default"/>
+      </w:rPr>
+    </w:lvl>
+    <w:lvl w:ilvl="8" w:tplc="4C090005" w:tentative="1">
+      <w:start w:val="1"/>
+      <w:numFmt w:val="bullet"/>
+      <w:lvlText w:val=""/>
+      <w:lvlJc w:val="left"/>
+      <w:pPr>
+        <w:ind w:left="7200" w:hanging="360"/>
+      </w:pPr>
+      <w:rPr>
+        <w:rFonts w:ascii="Wingdings" w:hAnsi="Wingdings" w:hint="default"/>
+      </w:rPr>
+    </w:lvl>
+  </w:abstractNum>
+  <w:abstractNum w:abstractNumId="12" w15:restartNumberingAfterBreak="0">
+    <w:nsid w:val="4FD27B89"/>
+    <w:multiLevelType w:val="multilevel"/>
+    <w:tmpl w:val="26C48E2E"/>
+    <w:lvl w:ilvl="0">
+      <w:start w:val="1"/>
+      <w:numFmt w:val="bullet"/>
+      <w:lvlText w:val=""/>
+      <w:lvlJc w:val="left"/>
+      <w:pPr>
+        <w:tabs>
+          <w:tab w:val="num" w:pos="720"/>
+        </w:tabs>
+        <w:ind w:left="720" w:hanging="360"/>
+      </w:pPr>
+      <w:rPr>
+        <w:rFonts w:ascii="Symbol" w:hAnsi="Symbol" w:hint="default"/>
+        <w:sz w:val="20"/>
+      </w:rPr>
+    </w:lvl>
+    <w:lvl w:ilvl="1" w:tentative="1">
+      <w:start w:val="1"/>
+      <w:numFmt w:val="bullet"/>
+      <w:lvlText w:val="o"/>
+      <w:lvlJc w:val="left"/>
+      <w:pPr>
+        <w:tabs>
+          <w:tab w:val="num" w:pos="1440"/>
+        </w:tabs>
+        <w:ind w:left="1440" w:hanging="360"/>
+      </w:pPr>
+      <w:rPr>
+        <w:rFonts w:ascii="Courier New" w:hAnsi="Courier New" w:hint="default"/>
+        <w:sz w:val="20"/>
+      </w:rPr>
+    </w:lvl>
+    <w:lvl w:ilvl="2" w:tentative="1">
+      <w:start w:val="1"/>
+      <w:numFmt w:val="bullet"/>
+      <w:lvlText w:val=""/>
+      <w:lvlJc w:val="left"/>
+      <w:pPr>
+        <w:tabs>
+          <w:tab w:val="num" w:pos="2160"/>
+        </w:tabs>
+        <w:ind w:left="2160" w:hanging="360"/>
+      </w:pPr>
+      <w:rPr>
+        <w:rFonts w:ascii="Wingdings" w:hAnsi="Wingdings" w:hint="default"/>
+        <w:sz w:val="20"/>
+      </w:rPr>
+    </w:lvl>
+    <w:lvl w:ilvl="3" w:tentative="1">
+      <w:start w:val="1"/>
+      <w:numFmt w:val="bullet"/>
+      <w:lvlText w:val=""/>
+      <w:lvlJc w:val="left"/>
+      <w:pPr>
+        <w:tabs>
+          <w:tab w:val="num" w:pos="2880"/>
+        </w:tabs>
+        <w:ind w:left="2880" w:hanging="360"/>
+      </w:pPr>
+      <w:rPr>
+        <w:rFonts w:ascii="Wingdings" w:hAnsi="Wingdings" w:hint="default"/>
+        <w:sz w:val="20"/>
+      </w:rPr>
+    </w:lvl>
+    <w:lvl w:ilvl="4" w:tentative="1">
+      <w:start w:val="1"/>
+      <w:numFmt w:val="bullet"/>
+      <w:lvlText w:val=""/>
+      <w:lvlJc w:val="left"/>
+      <w:pPr>
+        <w:tabs>
+          <w:tab w:val="num" w:pos="3600"/>
+        </w:tabs>
+        <w:ind w:left="3600" w:hanging="360"/>
+      </w:pPr>
+      <w:rPr>
+        <w:rFonts w:ascii="Wingdings" w:hAnsi="Wingdings" w:hint="default"/>
+        <w:sz w:val="20"/>
+      </w:rPr>
+    </w:lvl>
+    <w:lvl w:ilvl="5" w:tentative="1">
+      <w:start w:val="1"/>
+      <w:numFmt w:val="bullet"/>
+      <w:lvlText w:val=""/>
+      <w:lvlJc w:val="left"/>
+      <w:pPr>
+        <w:tabs>
+          <w:tab w:val="num" w:pos="4320"/>
+        </w:tabs>
+        <w:ind w:left="4320" w:hanging="360"/>
+      </w:pPr>
+      <w:rPr>
+        <w:rFonts w:ascii="Wingdings" w:hAnsi="Wingdings" w:hint="default"/>
+        <w:sz w:val="20"/>
+      </w:rPr>
+    </w:lvl>
+    <w:lvl w:ilvl="6" w:tentative="1">
+      <w:start w:val="1"/>
+      <w:numFmt w:val="bullet"/>
+      <w:lvlText w:val=""/>
+      <w:lvlJc w:val="left"/>
+      <w:pPr>
+        <w:tabs>
+          <w:tab w:val="num" w:pos="5040"/>
+        </w:tabs>
+        <w:ind w:left="5040" w:hanging="360"/>
+      </w:pPr>
+      <w:rPr>
+        <w:rFonts w:ascii="Wingdings" w:hAnsi="Wingdings" w:hint="default"/>
+        <w:sz w:val="20"/>
+      </w:rPr>
+    </w:lvl>
+    <w:lvl w:ilvl="7" w:tentative="1">
+      <w:start w:val="1"/>
+      <w:numFmt w:val="bullet"/>
+      <w:lvlText w:val=""/>
+      <w:lvlJc w:val="left"/>
+      <w:pPr>
+        <w:tabs>
+          <w:tab w:val="num" w:pos="5760"/>
+        </w:tabs>
+        <w:ind w:left="5760" w:hanging="360"/>
+      </w:pPr>
+      <w:rPr>
+        <w:rFonts w:ascii="Wingdings" w:hAnsi="Wingdings" w:hint="default"/>
+        <w:sz w:val="20"/>
+      </w:rPr>
+    </w:lvl>
+    <w:lvl w:ilvl="8" w:tentative="1">
+      <w:start w:val="1"/>
+      <w:numFmt w:val="bullet"/>
+      <w:lvlText w:val=""/>
+      <w:lvlJc w:val="left"/>
+      <w:pPr>
+        <w:tabs>
+          <w:tab w:val="num" w:pos="6480"/>
+        </w:tabs>
+        <w:ind w:left="6480" w:hanging="360"/>
+      </w:pPr>
+      <w:rPr>
+        <w:rFonts w:ascii="Wingdings" w:hAnsi="Wingdings" w:hint="default"/>
+        <w:sz w:val="20"/>
+      </w:rPr>
+    </w:lvl>
+  </w:abstractNum>
+  <w:abstractNum w:abstractNumId="13" w15:restartNumberingAfterBreak="0">
+    <w:nsid w:val="5B3A7F53"/>
+    <w:multiLevelType w:val="multilevel"/>
+    <w:tmpl w:val="ECB20F56"/>
+    <w:lvl w:ilvl="0">
+      <w:start w:val="1"/>
+      <w:numFmt w:val="bullet"/>
+      <w:lvlText w:val=""/>
+      <w:lvlJc w:val="left"/>
+      <w:pPr>
+        <w:tabs>
+          <w:tab w:val="num" w:pos="720"/>
+        </w:tabs>
+        <w:ind w:left="720" w:hanging="360"/>
+      </w:pPr>
+      <w:rPr>
+        <w:rFonts w:ascii="Symbol" w:hAnsi="Symbol" w:hint="default"/>
+        <w:sz w:val="20"/>
+      </w:rPr>
+    </w:lvl>
+    <w:lvl w:ilvl="1" w:tentative="1">
+      <w:start w:val="1"/>
+      <w:numFmt w:val="bullet"/>
+      <w:lvlText w:val="o"/>
+      <w:lvlJc w:val="left"/>
+      <w:pPr>
+        <w:tabs>
+          <w:tab w:val="num" w:pos="1440"/>
+        </w:tabs>
+        <w:ind w:left="1440" w:hanging="360"/>
+      </w:pPr>
+      <w:rPr>
+        <w:rFonts w:ascii="Courier New" w:hAnsi="Courier New" w:hint="default"/>
+        <w:sz w:val="20"/>
+      </w:rPr>
+    </w:lvl>
+    <w:lvl w:ilvl="2" w:tentative="1">
+      <w:start w:val="1"/>
+      <w:numFmt w:val="bullet"/>
+      <w:lvlText w:val=""/>
+      <w:lvlJc w:val="left"/>
+      <w:pPr>
+        <w:tabs>
+          <w:tab w:val="num" w:pos="2160"/>
+        </w:tabs>
+        <w:ind w:left="2160" w:hanging="360"/>
+      </w:pPr>
+      <w:rPr>
+        <w:rFonts w:ascii="Wingdings" w:hAnsi="Wingdings" w:hint="default"/>
+        <w:sz w:val="20"/>
+      </w:rPr>
+    </w:lvl>
+    <w:lvl w:ilvl="3" w:tentative="1">
+      <w:start w:val="1"/>
+      <w:numFmt w:val="bullet"/>
+      <w:lvlText w:val=""/>
+      <w:lvlJc w:val="left"/>
+      <w:pPr>
+        <w:tabs>
+          <w:tab w:val="num" w:pos="2880"/>
+        </w:tabs>
+        <w:ind w:left="2880" w:hanging="360"/>
+      </w:pPr>
+      <w:rPr>
+        <w:rFonts w:ascii="Wingdings" w:hAnsi="Wingdings" w:hint="default"/>
+        <w:sz w:val="20"/>
+      </w:rPr>
+    </w:lvl>
+    <w:lvl w:ilvl="4" w:tentative="1">
+      <w:start w:val="1"/>
+      <w:numFmt w:val="bullet"/>
+      <w:lvlText w:val=""/>
+      <w:lvlJc w:val="left"/>
+      <w:pPr>
+        <w:tabs>
+          <w:tab w:val="num" w:pos="3600"/>
+        </w:tabs>
+        <w:ind w:left="3600" w:hanging="360"/>
+      </w:pPr>
+      <w:rPr>
+        <w:rFonts w:ascii="Wingdings" w:hAnsi="Wingdings" w:hint="default"/>
+        <w:sz w:val="20"/>
+      </w:rPr>
+    </w:lvl>
+    <w:lvl w:ilvl="5" w:tentative="1">
+      <w:start w:val="1"/>
+      <w:numFmt w:val="bullet"/>
+      <w:lvlText w:val=""/>
+      <w:lvlJc w:val="left"/>
+      <w:pPr>
+        <w:tabs>
+          <w:tab w:val="num" w:pos="4320"/>
+        </w:tabs>
+        <w:ind w:left="4320" w:hanging="360"/>
+      </w:pPr>
+      <w:rPr>
+        <w:rFonts w:ascii="Wingdings" w:hAnsi="Wingdings" w:hint="default"/>
+        <w:sz w:val="20"/>
+      </w:rPr>
+    </w:lvl>
+    <w:lvl w:ilvl="6" w:tentative="1">
+      <w:start w:val="1"/>
+      <w:numFmt w:val="bullet"/>
+      <w:lvlText w:val=""/>
+      <w:lvlJc w:val="left"/>
+      <w:pPr>
+        <w:tabs>
+          <w:tab w:val="num" w:pos="5040"/>
+        </w:tabs>
+        <w:ind w:left="5040" w:hanging="360"/>
+      </w:pPr>
+      <w:rPr>
+        <w:rFonts w:ascii="Wingdings" w:hAnsi="Wingdings" w:hint="default"/>
+        <w:sz w:val="20"/>
+      </w:rPr>
+    </w:lvl>
+    <w:lvl w:ilvl="7" w:tentative="1">
+      <w:start w:val="1"/>
+      <w:numFmt w:val="bullet"/>
+      <w:lvlText w:val=""/>
+      <w:lvlJc w:val="left"/>
+      <w:pPr>
+        <w:tabs>
+          <w:tab w:val="num" w:pos="5760"/>
+        </w:tabs>
+        <w:ind w:left="5760" w:hanging="360"/>
+      </w:pPr>
+      <w:rPr>
+        <w:rFonts w:ascii="Wingdings" w:hAnsi="Wingdings" w:hint="default"/>
+        <w:sz w:val="20"/>
+      </w:rPr>
+    </w:lvl>
+    <w:lvl w:ilvl="8" w:tentative="1">
+      <w:start w:val="1"/>
+      <w:numFmt w:val="bullet"/>
+      <w:lvlText w:val=""/>
+      <w:lvlJc w:val="left"/>
+      <w:pPr>
+        <w:tabs>
+          <w:tab w:val="num" w:pos="6480"/>
+        </w:tabs>
+        <w:ind w:left="6480" w:hanging="360"/>
+      </w:pPr>
+      <w:rPr>
+        <w:rFonts w:ascii="Wingdings" w:hAnsi="Wingdings" w:hint="default"/>
+        <w:sz w:val="20"/>
+      </w:rPr>
+    </w:lvl>
+  </w:abstractNum>
+  <w:abstractNum w:abstractNumId="14" w15:restartNumberingAfterBreak="0">
     <w:nsid w:val="611F2C17"/>
     <w:multiLevelType w:val="multilevel"/>
     <w:tmpl w:val="3BEAF11E"/>
@@ -3696,7 +7813,7 @@
       </w:rPr>
     </w:lvl>
   </w:abstractNum>
-  <w:abstractNum w:abstractNumId="5" w15:restartNumberingAfterBreak="0">
+  <w:abstractNum w:abstractNumId="15" w15:restartNumberingAfterBreak="0">
     <w:nsid w:val="778739A9"/>
     <w:multiLevelType w:val="hybridMultilevel"/>
     <w:tmpl w:val="B76A03F8"/>
@@ -3785,7 +7902,7 @@
       </w:pPr>
     </w:lvl>
   </w:abstractNum>
-  <w:abstractNum w:abstractNumId="6" w15:restartNumberingAfterBreak="0">
+  <w:abstractNum w:abstractNumId="16" w15:restartNumberingAfterBreak="0">
     <w:nsid w:val="793E0DBF"/>
     <w:multiLevelType w:val="multilevel"/>
     <w:tmpl w:val="0C101D58"/>
@@ -3935,25 +8052,55 @@
     </w:lvl>
   </w:abstractNum>
   <w:num w:numId="1" w16cid:durableId="1084764703">
+    <w:abstractNumId w:val="1"/>
+  </w:num>
+  <w:num w:numId="2" w16cid:durableId="1775787429">
+    <w:abstractNumId w:val="15"/>
+  </w:num>
+  <w:num w:numId="3" w16cid:durableId="1587812146">
+    <w:abstractNumId w:val="2"/>
+  </w:num>
+  <w:num w:numId="4" w16cid:durableId="1727415709">
+    <w:abstractNumId w:val="14"/>
+  </w:num>
+  <w:num w:numId="5" w16cid:durableId="596988304">
+    <w:abstractNumId w:val="5"/>
+  </w:num>
+  <w:num w:numId="6" w16cid:durableId="1766920022">
+    <w:abstractNumId w:val="7"/>
+  </w:num>
+  <w:num w:numId="7" w16cid:durableId="361976452">
+    <w:abstractNumId w:val="16"/>
+  </w:num>
+  <w:num w:numId="8" w16cid:durableId="1470440005">
+    <w:abstractNumId w:val="6"/>
+  </w:num>
+  <w:num w:numId="9" w16cid:durableId="808131487">
+    <w:abstractNumId w:val="10"/>
+  </w:num>
+  <w:num w:numId="10" w16cid:durableId="1913421649">
+    <w:abstractNumId w:val="12"/>
+  </w:num>
+  <w:num w:numId="11" w16cid:durableId="1449664358">
+    <w:abstractNumId w:val="13"/>
+  </w:num>
+  <w:num w:numId="12" w16cid:durableId="2126003946">
+    <w:abstractNumId w:val="11"/>
+  </w:num>
+  <w:num w:numId="13" w16cid:durableId="876772451">
+    <w:abstractNumId w:val="8"/>
+  </w:num>
+  <w:num w:numId="14" w16cid:durableId="1495948540">
     <w:abstractNumId w:val="0"/>
   </w:num>
-  <w:num w:numId="2" w16cid:durableId="1775787429">
-    <w:abstractNumId w:val="5"/>
-  </w:num>
-  <w:num w:numId="3" w16cid:durableId="1587812146">
-    <w:abstractNumId w:val="1"/>
-  </w:num>
-  <w:num w:numId="4" w16cid:durableId="1727415709">
+  <w:num w:numId="15" w16cid:durableId="524291560">
     <w:abstractNumId w:val="4"/>
   </w:num>
-  <w:num w:numId="5" w16cid:durableId="596988304">
-    <w:abstractNumId w:val="2"/>
-  </w:num>
-  <w:num w:numId="6" w16cid:durableId="1766920022">
+  <w:num w:numId="16" w16cid:durableId="2142336275">
     <w:abstractNumId w:val="3"/>
   </w:num>
-  <w:num w:numId="7" w16cid:durableId="361976452">
-    <w:abstractNumId w:val="6"/>
+  <w:num w:numId="17" w16cid:durableId="1361662423">
+    <w:abstractNumId w:val="9"/>
   </w:num>
 </w:numbering>
 </file>
@@ -4386,7 +8533,6 @@
     <w:next w:val="Normal"/>
     <w:link w:val="Heading2Char"/>
     <w:uiPriority w:val="9"/>
-    <w:semiHidden/>
     <w:unhideWhenUsed/>
     <w:qFormat/>
     <w:rsid w:val="008418AD"/>
@@ -4602,7 +8748,6 @@
     <w:basedOn w:val="DefaultParagraphFont"/>
     <w:link w:val="Heading2"/>
     <w:uiPriority w:val="9"/>
-    <w:semiHidden/>
     <w:rsid w:val="008418AD"/>
     <w:rPr>
       <w:rFonts w:asciiTheme="majorHAnsi" w:eastAsiaTheme="majorEastAsia" w:hAnsiTheme="majorHAnsi" w:cstheme="majorBidi"/>
@@ -4905,7 +9050,6 @@
     <w:name w:val="Normal (Web)"/>
     <w:basedOn w:val="Normal"/>
     <w:uiPriority w:val="99"/>
-    <w:semiHidden/>
     <w:unhideWhenUsed/>
     <w:rsid w:val="003E25F0"/>
     <w:pPr>

</xml_diff>